<commit_message>
📊 Daily Chinese DB update: 2026-05-29 | 136/2000 expressions
</commit_message>
<xml_diff>
--- a/data/03_Print_PDF/Study_Note_2026-05-29.docx
+++ b/data/03_Print_PDF/Study_Note_2026-05-29.docx
@@ -12,7 +12,7 @@
           <w:rFonts w:ascii="맑은 고딕" w:hAnsi="맑은 고딕"/>
           <w:b/>
           <w:i w:val="0"/>
-          <w:color w:val="B42828"/>
+          <w:color w:val="1E64C8"/>
           <w:sz w:val="30"/>
           <w:rFonts w:eastAsia="Microsoft YaHei" w:ascii="맑은 고딕"/>
         </w:rPr>
@@ -33,7 +33,7 @@
           <w:sz w:val="18"/>
           <w:rFonts w:eastAsia="Microsoft YaHei" w:ascii="맑은 고딕"/>
         </w:rPr>
-        <w:t>오늘의 핵심 네이티브 표현  24개  ·  한어 병음 · 한국어 의미 · 원문 · 실전 예문 수록</w:t>
+        <w:t>오늘의 핵심 네이티브 표현  5개  ·  한어 병음 · 한국어 의미 · 원문 · 실전 예문 수록</w:t>
       </w:r>
     </w:p>
     <w:p>
@@ -56,11 +56,11 @@
           <w:rFonts w:ascii="Microsoft YaHei" w:hAnsi="Microsoft YaHei"/>
           <w:b/>
           <w:i w:val="0"/>
-          <w:color w:val="961414"/>
+          <w:color w:val="143CB4"/>
           <w:sz w:val="28"/>
           <w:rFonts w:eastAsia="Microsoft YaHei" w:ascii="Microsoft YaHei"/>
         </w:rPr>
-        <w:t>家长群炸了</w:t>
+        <w:t>召开</w:t>
       </w:r>
       <w:r>
         <w:rPr>
@@ -71,7 +71,7 @@
           <w:sz w:val="18"/>
           <w:rFonts w:eastAsia="Microsoft YaHei" w:ascii="Calibri"/>
         </w:rPr>
-        <w:t xml:space="preserve">   [COLLOQUIALISM]</w:t>
+        <w:t xml:space="preserve">   [VERB]</w:t>
       </w:r>
     </w:p>
     <w:p>
@@ -97,7 +97,7 @@
           <w:sz w:val="20"/>
           <w:rFonts w:eastAsia="Microsoft YaHei" w:ascii="Calibri"/>
         </w:rPr>
-        <w:t>jiāzhǎng qún zhà le</w:t>
+        <w:t>zhàokāi</w:t>
       </w:r>
     </w:p>
     <w:p>
@@ -123,7 +123,7 @@
           <w:sz w:val="21"/>
           <w:rFonts w:eastAsia="Microsoft YaHei" w:ascii="맑은 고딕"/>
         </w:rPr>
-        <w:t>학부모 단체 채팅방이 난리가 났다 (폭발했다)</w:t>
+        <w:t>(회의 등을) 개최하다, 열다</w:t>
       </w:r>
     </w:p>
     <w:p>
@@ -150,7 +150,7 @@
           <w:sz w:val="19"/>
           <w:rFonts w:eastAsia="Microsoft YaHei" w:ascii="Microsoft YaHei"/>
         </w:rPr>
-        <w:t>"家长群炸了！毕业生100%进世界前50！就读这所学..."</w:t>
+        <w:t>"江华工商业联合会（总商会）第十四次会员代表大会召开."</w:t>
       </w:r>
     </w:p>
     <w:p>
@@ -162,7 +162,7 @@
           <w:rFonts w:ascii="맑은 고딕" w:hAnsi="맑은 고딕"/>
           <w:b/>
           <w:i w:val="0"/>
-          <w:color w:val="B42828"/>
+          <w:color w:val="007850"/>
           <w:sz w:val="20"/>
           <w:rFonts w:eastAsia="Microsoft YaHei" w:ascii="맑은 고딕"/>
         </w:rPr>
@@ -173,11 +173,11 @@
           <w:rFonts w:ascii="Microsoft YaHei" w:hAnsi="Microsoft YaHei"/>
           <w:b/>
           <w:i w:val="0"/>
-          <w:color w:val="8C1E1E"/>
+          <w:color w:val="00643C"/>
           <w:sz w:val="21"/>
           <w:rFonts w:eastAsia="Microsoft YaHei" w:ascii="Microsoft YaHei"/>
         </w:rPr>
-        <w:t>老师一宣布放假通知，家长群里立刻就炸了，大家都在讨论出行计划。</w:t>
+        <w:t>经理决定下周一召开一次全体员工会议。</w:t>
       </w:r>
     </w:p>
     <w:p>
@@ -216,11 +216,11 @@
           <w:rFonts w:ascii="Microsoft YaHei" w:hAnsi="Microsoft YaHei"/>
           <w:b/>
           <w:i w:val="0"/>
-          <w:color w:val="961414"/>
+          <w:color w:val="143CB4"/>
           <w:sz w:val="28"/>
           <w:rFonts w:eastAsia="Microsoft YaHei" w:ascii="Microsoft YaHei"/>
         </w:rPr>
-        <w:t>社保</w:t>
+        <w:t>初心</w:t>
       </w:r>
       <w:r>
         <w:rPr>
@@ -231,7 +231,7 @@
           <w:sz w:val="18"/>
           <w:rFonts w:eastAsia="Microsoft YaHei" w:ascii="Calibri"/>
         </w:rPr>
-        <w:t xml:space="preserve">   [NOUN (COLLOQUIALISM/ABBREVIATION)]</w:t>
+        <w:t xml:space="preserve">   [NOUN]</w:t>
       </w:r>
     </w:p>
     <w:p>
@@ -257,7 +257,7 @@
           <w:sz w:val="20"/>
           <w:rFonts w:eastAsia="Microsoft YaHei" w:ascii="Calibri"/>
         </w:rPr>
-        <w:t>shèbǎo</w:t>
+        <w:t>chūxīn</w:t>
       </w:r>
     </w:p>
     <w:p>
@@ -283,7 +283,7 @@
           <w:sz w:val="21"/>
           <w:rFonts w:eastAsia="Microsoft YaHei" w:ascii="맑은 고딕"/>
         </w:rPr>
-        <w:t>사회 보험</w:t>
+        <w:t>초심, 처음의 마음</w:t>
       </w:r>
     </w:p>
     <w:p>
@@ -310,7 +310,7 @@
           <w:sz w:val="19"/>
           <w:rFonts w:eastAsia="Microsoft YaHei" w:ascii="Microsoft YaHei"/>
         </w:rPr>
-        <w:t>"无社保、无合同，工亡赔偿找谁要？"</w:t>
+        <w:t>"致敬劳动者｜出租车司机刘自立：用行动诠释劳模初心."</w:t>
       </w:r>
     </w:p>
     <w:p>
@@ -322,7 +322,7 @@
           <w:rFonts w:ascii="맑은 고딕" w:hAnsi="맑은 고딕"/>
           <w:b/>
           <w:i w:val="0"/>
-          <w:color w:val="B42828"/>
+          <w:color w:val="007850"/>
           <w:sz w:val="20"/>
           <w:rFonts w:eastAsia="Microsoft YaHei" w:ascii="맑은 고딕"/>
         </w:rPr>
@@ -333,11 +333,11 @@
           <w:rFonts w:ascii="Microsoft YaHei" w:hAnsi="Microsoft YaHei"/>
           <w:b/>
           <w:i w:val="0"/>
-          <w:color w:val="8C1E1E"/>
+          <w:color w:val="00643C"/>
           <w:sz w:val="21"/>
           <w:rFonts w:eastAsia="Microsoft YaHei" w:ascii="Microsoft YaHei"/>
         </w:rPr>
-        <w:t>新入职的员工，公司都会帮忙办理社保和公积金。</w:t>
+        <w:t>无论遇到什么困难，我们都不能忘记自己的初心。</w:t>
       </w:r>
     </w:p>
     <w:p>
@@ -376,11 +376,11 @@
           <w:rFonts w:ascii="Microsoft YaHei" w:hAnsi="Microsoft YaHei"/>
           <w:b/>
           <w:i w:val="0"/>
-          <w:color w:val="961414"/>
+          <w:color w:val="143CB4"/>
           <w:sz w:val="28"/>
           <w:rFonts w:eastAsia="Microsoft YaHei" w:ascii="Microsoft YaHei"/>
         </w:rPr>
-        <w:t>维权</w:t>
+        <w:t>冲刺</w:t>
       </w:r>
       <w:r>
         <w:rPr>
@@ -391,7 +391,7 @@
           <w:sz w:val="18"/>
           <w:rFonts w:eastAsia="Microsoft YaHei" w:ascii="Calibri"/>
         </w:rPr>
-        <w:t xml:space="preserve">   [SEPARABLE VERB]</w:t>
+        <w:t xml:space="preserve">   [VERB/NOUN]</w:t>
       </w:r>
     </w:p>
     <w:p>
@@ -417,7 +417,7 @@
           <w:sz w:val="20"/>
           <w:rFonts w:eastAsia="Microsoft YaHei" w:ascii="Calibri"/>
         </w:rPr>
-        <w:t>wéiquán</w:t>
+        <w:t>chōngcì</w:t>
       </w:r>
     </w:p>
     <w:p>
@@ -443,7 +443,7 @@
           <w:sz w:val="21"/>
           <w:rFonts w:eastAsia="Microsoft YaHei" w:ascii="맑은 고딕"/>
         </w:rPr>
-        <w:t>권리를 옹호하다; 권리를 지키다</w:t>
+        <w:t>(결승점을 향해) 전력 질주하다; (목표 달성을 위해) 마지막 박차를 가하다</w:t>
       </w:r>
     </w:p>
     <w:p>
@@ -470,7 +470,7 @@
           <w:sz w:val="19"/>
           <w:rFonts w:eastAsia="Microsoft YaHei" w:ascii="Microsoft YaHei"/>
         </w:rPr>
-        <w:t>"在工亡赔偿维权中，最让家属绝望的，莫过于“无社保、无合同”..."</w:t>
+        <w:t>"后来到了高考冲刺前100天，他又“突然消失”不来参加。"</w:t>
       </w:r>
     </w:p>
     <w:p>
@@ -482,7 +482,7 @@
           <w:rFonts w:ascii="맑은 고딕" w:hAnsi="맑은 고딕"/>
           <w:b/>
           <w:i w:val="0"/>
-          <w:color w:val="B42828"/>
+          <w:color w:val="007850"/>
           <w:sz w:val="20"/>
           <w:rFonts w:eastAsia="Microsoft YaHei" w:ascii="맑은 고딕"/>
         </w:rPr>
@@ -493,11 +493,11 @@
           <w:rFonts w:ascii="Microsoft YaHei" w:hAnsi="Microsoft YaHei"/>
           <w:b/>
           <w:i w:val="0"/>
-          <w:color w:val="8C1E1E"/>
+          <w:color w:val="00643C"/>
           <w:sz w:val="21"/>
           <w:rFonts w:eastAsia="Microsoft YaHei" w:ascii="Microsoft YaHei"/>
         </w:rPr>
-        <w:t>消费者在购买商品时，如果遇到质量问题，一定要学会维权。</w:t>
+        <w:t>离项目截止日期还有一周，我们必须冲刺了。</w:t>
       </w:r>
     </w:p>
     <w:p>
@@ -536,11 +536,11 @@
           <w:rFonts w:ascii="Microsoft YaHei" w:hAnsi="Microsoft YaHei"/>
           <w:b/>
           <w:i w:val="0"/>
-          <w:color w:val="961414"/>
+          <w:color w:val="143CB4"/>
           <w:sz w:val="28"/>
           <w:rFonts w:eastAsia="Microsoft YaHei" w:ascii="Microsoft YaHei"/>
         </w:rPr>
-        <w:t>失联跑路</w:t>
+        <w:t>开挂</w:t>
       </w:r>
       <w:r>
         <w:rPr>
@@ -551,7 +551,7 @@
           <w:sz w:val="18"/>
           <w:rFonts w:eastAsia="Microsoft YaHei" w:ascii="Calibri"/>
         </w:rPr>
-        <w:t xml:space="preserve">   [COLLOQUIALISM (VERB PHRASE)]</w:t>
+        <w:t xml:space="preserve">   [COLLOQUIALISM]</w:t>
       </w:r>
     </w:p>
     <w:p>
@@ -577,7 +577,7 @@
           <w:sz w:val="20"/>
           <w:rFonts w:eastAsia="Microsoft YaHei" w:ascii="Calibri"/>
         </w:rPr>
-        <w:t>shīlián pǎolù</w:t>
+        <w:t>kāi guà</w:t>
       </w:r>
     </w:p>
     <w:p>
@@ -603,7 +603,7 @@
           <w:sz w:val="21"/>
           <w:rFonts w:eastAsia="Microsoft YaHei" w:ascii="맑은 고딕"/>
         </w:rPr>
-        <w:t>연락이 끊기고 도주하다 (책임을 회피하기 위해)</w:t>
+        <w:t>(게임에서) 치트키를 쓰다; (비유적으로) 비정상적으로 뛰어나다, 엄청나게 잘하다</w:t>
       </w:r>
     </w:p>
     <w:p>
@@ -630,7 +630,7 @@
           <w:sz w:val="19"/>
           <w:rFonts w:eastAsia="Microsoft YaHei" w:ascii="Microsoft YaHei"/>
         </w:rPr>
-        <w:t>"...单位直接否认劳动关系，拒绝支付任何赔偿，甚至失联跑路。"</w:t>
+        <w:t>"成绩单一出，全员开挂：100%获得美国前30大学录取，75%斩获全美前20大学offer。"</w:t>
       </w:r>
     </w:p>
     <w:p>
@@ -642,7 +642,7 @@
           <w:rFonts w:ascii="맑은 고딕" w:hAnsi="맑은 고딕"/>
           <w:b/>
           <w:i w:val="0"/>
-          <w:color w:val="B42828"/>
+          <w:color w:val="007850"/>
           <w:sz w:val="20"/>
           <w:rFonts w:eastAsia="Microsoft YaHei" w:ascii="맑은 고딕"/>
         </w:rPr>
@@ -653,11 +653,11 @@
           <w:rFonts w:ascii="Microsoft YaHei" w:hAnsi="Microsoft YaHei"/>
           <w:b/>
           <w:i w:val="0"/>
-          <w:color w:val="8C1E1E"/>
+          <w:color w:val="00643C"/>
           <w:sz w:val="21"/>
           <w:rFonts w:eastAsia="Microsoft YaHei" w:ascii="Microsoft YaHei"/>
         </w:rPr>
-        <w:t>那家健身房突然关门，老板也失联跑路了，很多会员的钱都打了水漂。</w:t>
+        <w:t>他学习能力太强了，感觉像开了挂一样，什么知识点都能很快掌握。</w:t>
       </w:r>
     </w:p>
     <w:p>
@@ -696,11 +696,11 @@
           <w:rFonts w:ascii="Microsoft YaHei" w:hAnsi="Microsoft YaHei"/>
           <w:b/>
           <w:i w:val="0"/>
-          <w:color w:val="961414"/>
+          <w:color w:val="143CB4"/>
           <w:sz w:val="28"/>
           <w:rFonts w:eastAsia="Microsoft YaHei" w:ascii="Microsoft YaHei"/>
         </w:rPr>
-        <w:t>大咖</w:t>
+        <w:t>研发</w:t>
       </w:r>
       <w:r>
         <w:rPr>
@@ -711,7 +711,7 @@
           <w:sz w:val="18"/>
           <w:rFonts w:eastAsia="Microsoft YaHei" w:ascii="Calibri"/>
         </w:rPr>
-        <w:t xml:space="preserve">   [COLLOQUIALISM (NOUN)]</w:t>
+        <w:t xml:space="preserve">   [NOUN/VERB]</w:t>
       </w:r>
     </w:p>
     <w:p>
@@ -737,7 +737,7 @@
           <w:sz w:val="20"/>
           <w:rFonts w:eastAsia="Microsoft YaHei" w:ascii="Calibri"/>
         </w:rPr>
-        <w:t>dàkā</w:t>
+        <w:t>yán fā</w:t>
       </w:r>
     </w:p>
     <w:p>
@@ -763,7 +763,7 @@
           <w:sz w:val="21"/>
           <w:rFonts w:eastAsia="Microsoft YaHei" w:ascii="맑은 고딕"/>
         </w:rPr>
-        <w:t>거물; 전문가; 유명 인사</w:t>
+        <w:t>연구 개발 (R&amp;D); 연구 개발하다</w:t>
       </w:r>
     </w:p>
     <w:p>
@@ -790,7 +790,7 @@
           <w:sz w:val="19"/>
           <w:rFonts w:eastAsia="Microsoft YaHei" w:ascii="Microsoft YaHei"/>
         </w:rPr>
-        <w:t>"大咖说丨尹后庆：在教育家精神指引下，办好学校的价值..."</w:t>
+        <w:t>"公司主营高品质卫浴全系产品、建筑陶瓷及环保新材料（亚克力）的研发、生产与销售。"</w:t>
       </w:r>
     </w:p>
     <w:p>
@@ -802,7 +802,7 @@
           <w:rFonts w:ascii="맑은 고딕" w:hAnsi="맑은 고딕"/>
           <w:b/>
           <w:i w:val="0"/>
-          <w:color w:val="B42828"/>
+          <w:color w:val="007850"/>
           <w:sz w:val="20"/>
           <w:rFonts w:eastAsia="Microsoft YaHei" w:ascii="맑은 고딕"/>
         </w:rPr>
@@ -813,3051 +813,11 @@
           <w:rFonts w:ascii="Microsoft YaHei" w:hAnsi="Microsoft YaHei"/>
           <w:b/>
           <w:i w:val="0"/>
-          <w:color w:val="8C1E1E"/>
+          <w:color w:val="00643C"/>
           <w:sz w:val="21"/>
           <w:rFonts w:eastAsia="Microsoft YaHei" w:ascii="Microsoft YaHei"/>
         </w:rPr>
-        <w:t>这次行业峰会邀请了很多国内外的大咖来分享经验。</w:t>
-      </w:r>
-    </w:p>
-    <w:p>
-      <w:pPr>
-        <w:spacing w:before="120" w:after="0"/>
-      </w:pPr>
-      <w:r>
-        <w:rPr>
-          <w:rFonts w:ascii="맑은 고딕" w:hAnsi="맑은 고딕"/>
-          <w:b w:val="0"/>
-          <w:i w:val="0"/>
-          <w:color w:val="C8C8C8"/>
-          <w:sz w:val="14"/>
-          <w:rFonts w:eastAsia="Microsoft YaHei" w:ascii="맑은 고딕"/>
-        </w:rPr>
-        <w:t>────────────────────────────────────────────────────────────</w:t>
-      </w:r>
-    </w:p>
-    <w:p>
-      <w:pPr>
-        <w:spacing w:before="200" w:after="40"/>
-      </w:pPr>
-      <w:r>
-        <w:rPr>
-          <w:rFonts w:ascii="맑은 고딕" w:hAnsi="맑은 고딕"/>
-          <w:b w:val="0"/>
-          <w:i w:val="0"/>
-          <w:color w:val="969696"/>
-          <w:sz w:val="20"/>
-          <w:rFonts w:eastAsia="Microsoft YaHei" w:ascii="맑은 고딕"/>
-        </w:rPr>
-        <w:t xml:space="preserve">006.  </w:t>
-      </w:r>
-      <w:r>
-        <w:rPr>
-          <w:rFonts w:ascii="Microsoft YaHei" w:hAnsi="Microsoft YaHei"/>
-          <w:b/>
-          <w:i w:val="0"/>
-          <w:color w:val="961414"/>
-          <w:sz w:val="28"/>
-          <w:rFonts w:eastAsia="Microsoft YaHei" w:ascii="Microsoft YaHei"/>
-        </w:rPr>
-        <w:t>狂妄自大</w:t>
-      </w:r>
-      <w:r>
-        <w:rPr>
-          <w:rFonts w:ascii="Calibri" w:hAnsi="Calibri"/>
-          <w:b w:val="0"/>
-          <w:i w:val="0"/>
-          <w:color w:val="787878"/>
-          <w:sz w:val="18"/>
-          <w:rFonts w:eastAsia="Microsoft YaHei" w:ascii="Calibri"/>
-        </w:rPr>
-        <w:t xml:space="preserve">   [IDIOM]</w:t>
-      </w:r>
-    </w:p>
-    <w:p>
-      <w:pPr>
-        <w:spacing w:before="0" w:after="40"/>
-      </w:pPr>
-      <w:r>
-        <w:rPr>
-          <w:rFonts w:ascii="맑은 고딕" w:hAnsi="맑은 고딕"/>
-          <w:b w:val="0"/>
-          <w:i w:val="0"/>
-          <w:sz w:val="20"/>
-          <w:rFonts w:eastAsia="Microsoft YaHei" w:ascii="맑은 고딕"/>
-        </w:rPr>
-        <w:t xml:space="preserve">🔊 </w:t>
-      </w:r>
-      <w:r>
-        <w:rPr>
-          <w:rFonts w:ascii="Calibri" w:hAnsi="Calibri"/>
-          <w:b w:val="0"/>
-          <w:i/>
-          <w:color w:val="505050"/>
-          <w:sz w:val="20"/>
-          <w:rFonts w:eastAsia="Microsoft YaHei" w:ascii="Calibri"/>
-        </w:rPr>
-        <w:t>kuáng wàng zì dà</w:t>
-      </w:r>
-    </w:p>
-    <w:p>
-      <w:pPr>
-        <w:spacing w:before="0" w:after="60"/>
-      </w:pPr>
-      <w:r>
-        <w:rPr>
-          <w:rFonts w:ascii="맑은 고딕" w:hAnsi="맑은 고딕"/>
-          <w:b/>
-          <w:i w:val="0"/>
-          <w:color w:val="282828"/>
-          <w:sz w:val="20"/>
-          <w:rFonts w:eastAsia="Microsoft YaHei" w:ascii="맑은 고딕"/>
-        </w:rPr>
-        <w:t xml:space="preserve">💡 의미  </w:t>
-      </w:r>
-      <w:r>
-        <w:rPr>
-          <w:rFonts w:ascii="맑은 고딕" w:hAnsi="맑은 고딕"/>
-          <w:b w:val="0"/>
-          <w:i w:val="0"/>
-          <w:sz w:val="21"/>
-          <w:rFonts w:eastAsia="Microsoft YaHei" w:ascii="맑은 고딕"/>
-        </w:rPr>
-        <w:t>오만방자하다; 거만하다</w:t>
-      </w:r>
-    </w:p>
-    <w:p>
-      <w:pPr>
-        <w:spacing w:before="0" w:after="40"/>
-      </w:pPr>
-      <w:r>
-        <w:rPr>
-          <w:rFonts w:ascii="맑은 고딕" w:hAnsi="맑은 고딕"/>
-          <w:b/>
-          <w:i w:val="0"/>
-          <w:color w:val="646464"/>
-          <w:sz w:val="19"/>
-          <w:rFonts w:eastAsia="Microsoft YaHei" w:ascii="맑은 고딕"/>
-        </w:rPr>
-        <w:t xml:space="preserve">📌 원문  </w:t>
-      </w:r>
-      <w:r>
-        <w:rPr>
-          <w:rFonts w:ascii="Microsoft YaHei" w:hAnsi="Microsoft YaHei"/>
-          <w:b w:val="0"/>
-          <w:i/>
-          <w:color w:val="5A5A5A"/>
-          <w:sz w:val="19"/>
-          <w:rFonts w:eastAsia="Microsoft YaHei" w:ascii="Microsoft YaHei"/>
-        </w:rPr>
-        <w:t>"班主任怒斥狂妄自大..."</w:t>
-      </w:r>
-    </w:p>
-    <w:p>
-      <w:pPr>
-        <w:spacing w:before="40" w:after="40"/>
-      </w:pPr>
-      <w:r>
-        <w:rPr>
-          <w:rFonts w:ascii="맑은 고딕" w:hAnsi="맑은 고딕"/>
-          <w:b/>
-          <w:i w:val="0"/>
-          <w:color w:val="B42828"/>
-          <w:sz w:val="20"/>
-          <w:rFonts w:eastAsia="Microsoft YaHei" w:ascii="맑은 고딕"/>
-        </w:rPr>
-        <w:t xml:space="preserve">✏️ 예문  </w:t>
-      </w:r>
-      <w:r>
-        <w:rPr>
-          <w:rFonts w:ascii="Microsoft YaHei" w:hAnsi="Microsoft YaHei"/>
-          <w:b/>
-          <w:i w:val="0"/>
-          <w:color w:val="8C1E1E"/>
-          <w:sz w:val="21"/>
-          <w:rFonts w:eastAsia="Microsoft YaHei" w:ascii="Microsoft YaHei"/>
-        </w:rPr>
-        <w:t>他总是觉得自己比别人强，有点狂妄自大。</w:t>
-      </w:r>
-    </w:p>
-    <w:p>
-      <w:pPr>
-        <w:spacing w:before="120" w:after="0"/>
-      </w:pPr>
-      <w:r>
-        <w:rPr>
-          <w:rFonts w:ascii="맑은 고딕" w:hAnsi="맑은 고딕"/>
-          <w:b w:val="0"/>
-          <w:i w:val="0"/>
-          <w:color w:val="C8C8C8"/>
-          <w:sz w:val="14"/>
-          <w:rFonts w:eastAsia="Microsoft YaHei" w:ascii="맑은 고딕"/>
-        </w:rPr>
-        <w:t>────────────────────────────────────────────────────────────</w:t>
-      </w:r>
-    </w:p>
-    <w:p>
-      <w:pPr>
-        <w:spacing w:before="200" w:after="40"/>
-      </w:pPr>
-      <w:r>
-        <w:rPr>
-          <w:rFonts w:ascii="맑은 고딕" w:hAnsi="맑은 고딕"/>
-          <w:b w:val="0"/>
-          <w:i w:val="0"/>
-          <w:color w:val="969696"/>
-          <w:sz w:val="20"/>
-          <w:rFonts w:eastAsia="Microsoft YaHei" w:ascii="맑은 고딕"/>
-        </w:rPr>
-        <w:t xml:space="preserve">007.  </w:t>
-      </w:r>
-      <w:r>
-        <w:rPr>
-          <w:rFonts w:ascii="Microsoft YaHei" w:hAnsi="Microsoft YaHei"/>
-          <w:b/>
-          <w:i w:val="0"/>
-          <w:color w:val="961414"/>
-          <w:sz w:val="28"/>
-          <w:rFonts w:eastAsia="Microsoft YaHei" w:ascii="Microsoft YaHei"/>
-        </w:rPr>
-        <w:t>贯彻落实</w:t>
-      </w:r>
-      <w:r>
-        <w:rPr>
-          <w:rFonts w:ascii="Calibri" w:hAnsi="Calibri"/>
-          <w:b w:val="0"/>
-          <w:i w:val="0"/>
-          <w:color w:val="787878"/>
-          <w:sz w:val="18"/>
-          <w:rFonts w:eastAsia="Microsoft YaHei" w:ascii="Calibri"/>
-        </w:rPr>
-        <w:t xml:space="preserve">   [VERB PHRASE]</w:t>
-      </w:r>
-    </w:p>
-    <w:p>
-      <w:pPr>
-        <w:spacing w:before="0" w:after="40"/>
-      </w:pPr>
-      <w:r>
-        <w:rPr>
-          <w:rFonts w:ascii="맑은 고딕" w:hAnsi="맑은 고딕"/>
-          <w:b w:val="0"/>
-          <w:i w:val="0"/>
-          <w:sz w:val="20"/>
-          <w:rFonts w:eastAsia="Microsoft YaHei" w:ascii="맑은 고딕"/>
-        </w:rPr>
-        <w:t xml:space="preserve">🔊 </w:t>
-      </w:r>
-      <w:r>
-        <w:rPr>
-          <w:rFonts w:ascii="Calibri" w:hAnsi="Calibri"/>
-          <w:b w:val="0"/>
-          <w:i/>
-          <w:color w:val="505050"/>
-          <w:sz w:val="20"/>
-          <w:rFonts w:eastAsia="Microsoft YaHei" w:ascii="Calibri"/>
-        </w:rPr>
-        <w:t>guàn chè luò shí</w:t>
-      </w:r>
-    </w:p>
-    <w:p>
-      <w:pPr>
-        <w:spacing w:before="0" w:after="60"/>
-      </w:pPr>
-      <w:r>
-        <w:rPr>
-          <w:rFonts w:ascii="맑은 고딕" w:hAnsi="맑은 고딕"/>
-          <w:b/>
-          <w:i w:val="0"/>
-          <w:color w:val="282828"/>
-          <w:sz w:val="20"/>
-          <w:rFonts w:eastAsia="Microsoft YaHei" w:ascii="맑은 고딕"/>
-        </w:rPr>
-        <w:t xml:space="preserve">💡 의미  </w:t>
-      </w:r>
-      <w:r>
-        <w:rPr>
-          <w:rFonts w:ascii="맑은 고딕" w:hAnsi="맑은 고딕"/>
-          <w:b w:val="0"/>
-          <w:i w:val="0"/>
-          <w:sz w:val="21"/>
-          <w:rFonts w:eastAsia="Microsoft YaHei" w:ascii="맑은 고딕"/>
-        </w:rPr>
-        <w:t>철저히 이행하다; 관철시키다</w:t>
-      </w:r>
-    </w:p>
-    <w:p>
-      <w:pPr>
-        <w:spacing w:before="0" w:after="40"/>
-      </w:pPr>
-      <w:r>
-        <w:rPr>
-          <w:rFonts w:ascii="맑은 고딕" w:hAnsi="맑은 고딕"/>
-          <w:b/>
-          <w:i w:val="0"/>
-          <w:color w:val="646464"/>
-          <w:sz w:val="19"/>
-          <w:rFonts w:eastAsia="Microsoft YaHei" w:ascii="맑은 고딕"/>
-        </w:rPr>
-        <w:t xml:space="preserve">📌 원문  </w:t>
-      </w:r>
-      <w:r>
-        <w:rPr>
-          <w:rFonts w:ascii="Microsoft YaHei" w:hAnsi="Microsoft YaHei"/>
-          <w:b w:val="0"/>
-          <w:i/>
-          <w:color w:val="5A5A5A"/>
-          <w:sz w:val="19"/>
-          <w:rFonts w:eastAsia="Microsoft YaHei" w:ascii="Microsoft YaHei"/>
-        </w:rPr>
-        <w:t>"要深入贯彻落实习近平总书记在雄安新区考察时的重要讲话精神..."</w:t>
-      </w:r>
-    </w:p>
-    <w:p>
-      <w:pPr>
-        <w:spacing w:before="40" w:after="40"/>
-      </w:pPr>
-      <w:r>
-        <w:rPr>
-          <w:rFonts w:ascii="맑은 고딕" w:hAnsi="맑은 고딕"/>
-          <w:b/>
-          <w:i w:val="0"/>
-          <w:color w:val="B42828"/>
-          <w:sz w:val="20"/>
-          <w:rFonts w:eastAsia="Microsoft YaHei" w:ascii="맑은 고딕"/>
-        </w:rPr>
-        <w:t xml:space="preserve">✏️ 예문  </w:t>
-      </w:r>
-      <w:r>
-        <w:rPr>
-          <w:rFonts w:ascii="Microsoft YaHei" w:hAnsi="Microsoft YaHei"/>
-          <w:b/>
-          <w:i w:val="0"/>
-          <w:color w:val="8C1E1E"/>
-          <w:sz w:val="21"/>
-          <w:rFonts w:eastAsia="Microsoft YaHei" w:ascii="Microsoft YaHei"/>
-        </w:rPr>
-        <w:t>会议强调，要将新政策精神贯彻落实到每个部门。</w:t>
-      </w:r>
-    </w:p>
-    <w:p>
-      <w:pPr>
-        <w:spacing w:before="120" w:after="0"/>
-      </w:pPr>
-      <w:r>
-        <w:rPr>
-          <w:rFonts w:ascii="맑은 고딕" w:hAnsi="맑은 고딕"/>
-          <w:b w:val="0"/>
-          <w:i w:val="0"/>
-          <w:color w:val="C8C8C8"/>
-          <w:sz w:val="14"/>
-          <w:rFonts w:eastAsia="Microsoft YaHei" w:ascii="맑은 고딕"/>
-        </w:rPr>
-        <w:t>────────────────────────────────────────────────────────────</w:t>
-      </w:r>
-    </w:p>
-    <w:p>
-      <w:pPr>
-        <w:spacing w:before="200" w:after="40"/>
-      </w:pPr>
-      <w:r>
-        <w:rPr>
-          <w:rFonts w:ascii="맑은 고딕" w:hAnsi="맑은 고딕"/>
-          <w:b w:val="0"/>
-          <w:i w:val="0"/>
-          <w:color w:val="969696"/>
-          <w:sz w:val="20"/>
-          <w:rFonts w:eastAsia="Microsoft YaHei" w:ascii="맑은 고딕"/>
-        </w:rPr>
-        <w:t xml:space="preserve">008.  </w:t>
-      </w:r>
-      <w:r>
-        <w:rPr>
-          <w:rFonts w:ascii="Microsoft YaHei" w:hAnsi="Microsoft YaHei"/>
-          <w:b/>
-          <w:i w:val="0"/>
-          <w:color w:val="961414"/>
-          <w:sz w:val="28"/>
-          <w:rFonts w:eastAsia="Microsoft YaHei" w:ascii="Microsoft YaHei"/>
-        </w:rPr>
-        <w:t>提速提质</w:t>
-      </w:r>
-      <w:r>
-        <w:rPr>
-          <w:rFonts w:ascii="Calibri" w:hAnsi="Calibri"/>
-          <w:b w:val="0"/>
-          <w:i w:val="0"/>
-          <w:color w:val="787878"/>
-          <w:sz w:val="18"/>
-          <w:rFonts w:eastAsia="Microsoft YaHei" w:ascii="Calibri"/>
-        </w:rPr>
-        <w:t xml:space="preserve">   [COLLOQUIALISM]</w:t>
-      </w:r>
-    </w:p>
-    <w:p>
-      <w:pPr>
-        <w:spacing w:before="0" w:after="40"/>
-      </w:pPr>
-      <w:r>
-        <w:rPr>
-          <w:rFonts w:ascii="맑은 고딕" w:hAnsi="맑은 고딕"/>
-          <w:b w:val="0"/>
-          <w:i w:val="0"/>
-          <w:sz w:val="20"/>
-          <w:rFonts w:eastAsia="Microsoft YaHei" w:ascii="맑은 고딕"/>
-        </w:rPr>
-        <w:t xml:space="preserve">🔊 </w:t>
-      </w:r>
-      <w:r>
-        <w:rPr>
-          <w:rFonts w:ascii="Calibri" w:hAnsi="Calibri"/>
-          <w:b w:val="0"/>
-          <w:i/>
-          <w:color w:val="505050"/>
-          <w:sz w:val="20"/>
-          <w:rFonts w:eastAsia="Microsoft YaHei" w:ascii="Calibri"/>
-        </w:rPr>
-        <w:t>tí sù tí zhì</w:t>
-      </w:r>
-    </w:p>
-    <w:p>
-      <w:pPr>
-        <w:spacing w:before="0" w:after="60"/>
-      </w:pPr>
-      <w:r>
-        <w:rPr>
-          <w:rFonts w:ascii="맑은 고딕" w:hAnsi="맑은 고딕"/>
-          <w:b/>
-          <w:i w:val="0"/>
-          <w:color w:val="282828"/>
-          <w:sz w:val="20"/>
-          <w:rFonts w:eastAsia="Microsoft YaHei" w:ascii="맑은 고딕"/>
-        </w:rPr>
-        <w:t xml:space="preserve">💡 의미  </w:t>
-      </w:r>
-      <w:r>
-        <w:rPr>
-          <w:rFonts w:ascii="맑은 고딕" w:hAnsi="맑은 고딕"/>
-          <w:b w:val="0"/>
-          <w:i w:val="0"/>
-          <w:sz w:val="21"/>
-          <w:rFonts w:eastAsia="Microsoft YaHei" w:ascii="맑은 고딕"/>
-        </w:rPr>
-        <w:t>속도를 높이고 품질을 향상시키다</w:t>
-      </w:r>
-    </w:p>
-    <w:p>
-      <w:pPr>
-        <w:spacing w:before="0" w:after="40"/>
-      </w:pPr>
-      <w:r>
-        <w:rPr>
-          <w:rFonts w:ascii="맑은 고딕" w:hAnsi="맑은 고딕"/>
-          <w:b/>
-          <w:i w:val="0"/>
-          <w:color w:val="646464"/>
-          <w:sz w:val="19"/>
-          <w:rFonts w:eastAsia="Microsoft YaHei" w:ascii="맑은 고딕"/>
-        </w:rPr>
-        <w:t xml:space="preserve">📌 원문  </w:t>
-      </w:r>
-      <w:r>
-        <w:rPr>
-          <w:rFonts w:ascii="Microsoft YaHei" w:hAnsi="Microsoft YaHei"/>
-          <w:b w:val="0"/>
-          <w:i/>
-          <w:color w:val="5A5A5A"/>
-          <w:sz w:val="19"/>
-          <w:rFonts w:eastAsia="Microsoft YaHei" w:ascii="Microsoft YaHei"/>
-        </w:rPr>
-        <w:t>"推动北京地区高校向雄安疏解和承接工作提速提质..."</w:t>
-      </w:r>
-    </w:p>
-    <w:p>
-      <w:pPr>
-        <w:spacing w:before="40" w:after="40"/>
-      </w:pPr>
-      <w:r>
-        <w:rPr>
-          <w:rFonts w:ascii="맑은 고딕" w:hAnsi="맑은 고딕"/>
-          <w:b/>
-          <w:i w:val="0"/>
-          <w:color w:val="B42828"/>
-          <w:sz w:val="20"/>
-          <w:rFonts w:eastAsia="Microsoft YaHei" w:ascii="맑은 고딕"/>
-        </w:rPr>
-        <w:t xml:space="preserve">✏️ 예문  </w:t>
-      </w:r>
-      <w:r>
-        <w:rPr>
-          <w:rFonts w:ascii="Microsoft YaHei" w:hAnsi="Microsoft YaHei"/>
-          <w:b/>
-          <w:i w:val="0"/>
-          <w:color w:val="8C1E1E"/>
-          <w:sz w:val="21"/>
-          <w:rFonts w:eastAsia="Microsoft YaHei" w:ascii="Microsoft YaHei"/>
-        </w:rPr>
-        <w:t>为了应对市场变化，我们必须在产品研发上提速提质。</w:t>
-      </w:r>
-    </w:p>
-    <w:p>
-      <w:pPr>
-        <w:spacing w:before="120" w:after="0"/>
-      </w:pPr>
-      <w:r>
-        <w:rPr>
-          <w:rFonts w:ascii="맑은 고딕" w:hAnsi="맑은 고딕"/>
-          <w:b w:val="0"/>
-          <w:i w:val="0"/>
-          <w:color w:val="C8C8C8"/>
-          <w:sz w:val="14"/>
-          <w:rFonts w:eastAsia="Microsoft YaHei" w:ascii="맑은 고딕"/>
-        </w:rPr>
-        <w:t>────────────────────────────────────────────────────────────</w:t>
-      </w:r>
-    </w:p>
-    <w:p>
-      <w:pPr>
-        <w:spacing w:before="200" w:after="40"/>
-      </w:pPr>
-      <w:r>
-        <w:rPr>
-          <w:rFonts w:ascii="맑은 고딕" w:hAnsi="맑은 고딕"/>
-          <w:b w:val="0"/>
-          <w:i w:val="0"/>
-          <w:color w:val="969696"/>
-          <w:sz w:val="20"/>
-          <w:rFonts w:eastAsia="Microsoft YaHei" w:ascii="맑은 고딕"/>
-        </w:rPr>
-        <w:t xml:space="preserve">009.  </w:t>
-      </w:r>
-      <w:r>
-        <w:rPr>
-          <w:rFonts w:ascii="Microsoft YaHei" w:hAnsi="Microsoft YaHei"/>
-          <w:b/>
-          <w:i w:val="0"/>
-          <w:color w:val="961414"/>
-          <w:sz w:val="28"/>
-          <w:rFonts w:eastAsia="Microsoft YaHei" w:ascii="Microsoft YaHei"/>
-        </w:rPr>
-        <w:t>成绩出炉</w:t>
-      </w:r>
-      <w:r>
-        <w:rPr>
-          <w:rFonts w:ascii="Calibri" w:hAnsi="Calibri"/>
-          <w:b w:val="0"/>
-          <w:i w:val="0"/>
-          <w:color w:val="787878"/>
-          <w:sz w:val="18"/>
-          <w:rFonts w:eastAsia="Microsoft YaHei" w:ascii="Calibri"/>
-        </w:rPr>
-        <w:t xml:space="preserve">   [COLLOQUIALISM]</w:t>
-      </w:r>
-    </w:p>
-    <w:p>
-      <w:pPr>
-        <w:spacing w:before="0" w:after="40"/>
-      </w:pPr>
-      <w:r>
-        <w:rPr>
-          <w:rFonts w:ascii="맑은 고딕" w:hAnsi="맑은 고딕"/>
-          <w:b w:val="0"/>
-          <w:i w:val="0"/>
-          <w:sz w:val="20"/>
-          <w:rFonts w:eastAsia="Microsoft YaHei" w:ascii="맑은 고딕"/>
-        </w:rPr>
-        <w:t xml:space="preserve">🔊 </w:t>
-      </w:r>
-      <w:r>
-        <w:rPr>
-          <w:rFonts w:ascii="Calibri" w:hAnsi="Calibri"/>
-          <w:b w:val="0"/>
-          <w:i/>
-          <w:color w:val="505050"/>
-          <w:sz w:val="20"/>
-          <w:rFonts w:eastAsia="Microsoft YaHei" w:ascii="Calibri"/>
-        </w:rPr>
-        <w:t>chéng jì chū lú</w:t>
-      </w:r>
-    </w:p>
-    <w:p>
-      <w:pPr>
-        <w:spacing w:before="0" w:after="60"/>
-      </w:pPr>
-      <w:r>
-        <w:rPr>
-          <w:rFonts w:ascii="맑은 고딕" w:hAnsi="맑은 고딕"/>
-          <w:b/>
-          <w:i w:val="0"/>
-          <w:color w:val="282828"/>
-          <w:sz w:val="20"/>
-          <w:rFonts w:eastAsia="Microsoft YaHei" w:ascii="맑은 고딕"/>
-        </w:rPr>
-        <w:t xml:space="preserve">💡 의미  </w:t>
-      </w:r>
-      <w:r>
-        <w:rPr>
-          <w:rFonts w:ascii="맑은 고딕" w:hAnsi="맑은 고딕"/>
-          <w:b w:val="0"/>
-          <w:i w:val="0"/>
-          <w:sz w:val="21"/>
-          <w:rFonts w:eastAsia="Microsoft YaHei" w:ascii="맑은 고딕"/>
-        </w:rPr>
-        <w:t>성적이 발표되다; 결과가 나오다</w:t>
-      </w:r>
-    </w:p>
-    <w:p>
-      <w:pPr>
-        <w:spacing w:before="0" w:after="40"/>
-      </w:pPr>
-      <w:r>
-        <w:rPr>
-          <w:rFonts w:ascii="맑은 고딕" w:hAnsi="맑은 고딕"/>
-          <w:b/>
-          <w:i w:val="0"/>
-          <w:color w:val="646464"/>
-          <w:sz w:val="19"/>
-          <w:rFonts w:eastAsia="Microsoft YaHei" w:ascii="맑은 고딕"/>
-        </w:rPr>
-        <w:t xml:space="preserve">📌 원문  </w:t>
-      </w:r>
-      <w:r>
-        <w:rPr>
-          <w:rFonts w:ascii="Microsoft YaHei" w:hAnsi="Microsoft YaHei"/>
-          <w:b w:val="0"/>
-          <w:i/>
-          <w:color w:val="5A5A5A"/>
-          <w:sz w:val="19"/>
-          <w:rFonts w:eastAsia="Microsoft YaHei" w:ascii="Microsoft YaHei"/>
-        </w:rPr>
-        <w:t>"高考成绩出炉，普通大学都没有他的名字..."</w:t>
-      </w:r>
-    </w:p>
-    <w:p>
-      <w:pPr>
-        <w:spacing w:before="40" w:after="40"/>
-      </w:pPr>
-      <w:r>
-        <w:rPr>
-          <w:rFonts w:ascii="맑은 고딕" w:hAnsi="맑은 고딕"/>
-          <w:b/>
-          <w:i w:val="0"/>
-          <w:color w:val="B42828"/>
-          <w:sz w:val="20"/>
-          <w:rFonts w:eastAsia="Microsoft YaHei" w:ascii="맑은 고딕"/>
-        </w:rPr>
-        <w:t xml:space="preserve">✏️ 예문  </w:t>
-      </w:r>
-      <w:r>
-        <w:rPr>
-          <w:rFonts w:ascii="Microsoft YaHei" w:hAnsi="Microsoft YaHei"/>
-          <w:b/>
-          <w:i w:val="0"/>
-          <w:color w:val="8C1E1E"/>
-          <w:sz w:val="21"/>
-          <w:rFonts w:eastAsia="Microsoft YaHei" w:ascii="Microsoft YaHei"/>
-        </w:rPr>
-        <w:t>经过一个月的等待，项目最终评估成绩终于出炉了。</w:t>
-      </w:r>
-    </w:p>
-    <w:p>
-      <w:pPr>
-        <w:spacing w:before="120" w:after="0"/>
-      </w:pPr>
-      <w:r>
-        <w:rPr>
-          <w:rFonts w:ascii="맑은 고딕" w:hAnsi="맑은 고딕"/>
-          <w:b w:val="0"/>
-          <w:i w:val="0"/>
-          <w:color w:val="C8C8C8"/>
-          <w:sz w:val="14"/>
-          <w:rFonts w:eastAsia="Microsoft YaHei" w:ascii="맑은 고딕"/>
-        </w:rPr>
-        <w:t>────────────────────────────────────────────────────────────</w:t>
-      </w:r>
-    </w:p>
-    <w:p>
-      <w:pPr>
-        <w:spacing w:before="200" w:after="40"/>
-      </w:pPr>
-      <w:r>
-        <w:rPr>
-          <w:rFonts w:ascii="맑은 고딕" w:hAnsi="맑은 고딕"/>
-          <w:b w:val="0"/>
-          <w:i w:val="0"/>
-          <w:color w:val="969696"/>
-          <w:sz w:val="20"/>
-          <w:rFonts w:eastAsia="Microsoft YaHei" w:ascii="맑은 고딕"/>
-        </w:rPr>
-        <w:t xml:space="preserve">010.  </w:t>
-      </w:r>
-      <w:r>
-        <w:rPr>
-          <w:rFonts w:ascii="Microsoft YaHei" w:hAnsi="Microsoft YaHei"/>
-          <w:b/>
-          <w:i w:val="0"/>
-          <w:color w:val="961414"/>
-          <w:sz w:val="28"/>
-          <w:rFonts w:eastAsia="Microsoft YaHei" w:ascii="Microsoft YaHei"/>
-        </w:rPr>
-        <w:t>一眼识破</w:t>
-      </w:r>
-      <w:r>
-        <w:rPr>
-          <w:rFonts w:ascii="Calibri" w:hAnsi="Calibri"/>
-          <w:b w:val="0"/>
-          <w:i w:val="0"/>
-          <w:color w:val="787878"/>
-          <w:sz w:val="18"/>
-          <w:rFonts w:eastAsia="Microsoft YaHei" w:ascii="Calibri"/>
-        </w:rPr>
-        <w:t xml:space="preserve">   [COLLOQUIALISM]</w:t>
-      </w:r>
-    </w:p>
-    <w:p>
-      <w:pPr>
-        <w:spacing w:before="0" w:after="40"/>
-      </w:pPr>
-      <w:r>
-        <w:rPr>
-          <w:rFonts w:ascii="맑은 고딕" w:hAnsi="맑은 고딕"/>
-          <w:b w:val="0"/>
-          <w:i w:val="0"/>
-          <w:sz w:val="20"/>
-          <w:rFonts w:eastAsia="Microsoft YaHei" w:ascii="맑은 고딕"/>
-        </w:rPr>
-        <w:t xml:space="preserve">🔊 </w:t>
-      </w:r>
-      <w:r>
-        <w:rPr>
-          <w:rFonts w:ascii="Calibri" w:hAnsi="Calibri"/>
-          <w:b w:val="0"/>
-          <w:i/>
-          <w:color w:val="505050"/>
-          <w:sz w:val="20"/>
-          <w:rFonts w:eastAsia="Microsoft YaHei" w:ascii="Calibri"/>
-        </w:rPr>
-        <w:t>yī yǎn shí pò</w:t>
-      </w:r>
-    </w:p>
-    <w:p>
-      <w:pPr>
-        <w:spacing w:before="0" w:after="60"/>
-      </w:pPr>
-      <w:r>
-        <w:rPr>
-          <w:rFonts w:ascii="맑은 고딕" w:hAnsi="맑은 고딕"/>
-          <w:b/>
-          <w:i w:val="0"/>
-          <w:color w:val="282828"/>
-          <w:sz w:val="20"/>
-          <w:rFonts w:eastAsia="Microsoft YaHei" w:ascii="맑은 고딕"/>
-        </w:rPr>
-        <w:t xml:space="preserve">💡 의미  </w:t>
-      </w:r>
-      <w:r>
-        <w:rPr>
-          <w:rFonts w:ascii="맑은 고딕" w:hAnsi="맑은 고딕"/>
-          <w:b w:val="0"/>
-          <w:i w:val="0"/>
-          <w:sz w:val="21"/>
-          <w:rFonts w:eastAsia="Microsoft YaHei" w:ascii="맑은 고딕"/>
-        </w:rPr>
-        <w:t>한눈에 간파하다, 한눈에 알아채다</w:t>
-      </w:r>
-    </w:p>
-    <w:p>
-      <w:pPr>
-        <w:spacing w:before="0" w:after="40"/>
-      </w:pPr>
-      <w:r>
-        <w:rPr>
-          <w:rFonts w:ascii="맑은 고딕" w:hAnsi="맑은 고딕"/>
-          <w:b/>
-          <w:i w:val="0"/>
-          <w:color w:val="646464"/>
-          <w:sz w:val="19"/>
-          <w:rFonts w:eastAsia="Microsoft YaHei" w:ascii="맑은 고딕"/>
-        </w:rPr>
-        <w:t xml:space="preserve">📌 원문  </w:t>
-      </w:r>
-      <w:r>
-        <w:rPr>
-          <w:rFonts w:ascii="Microsoft YaHei" w:hAnsi="Microsoft YaHei"/>
-          <w:b w:val="0"/>
-          <w:i/>
-          <w:color w:val="5A5A5A"/>
-          <w:sz w:val="19"/>
-          <w:rFonts w:eastAsia="Microsoft YaHei" w:ascii="Microsoft YaHei"/>
-        </w:rPr>
-        <w:t>"法官一眼识破：假的！"</w:t>
-      </w:r>
-    </w:p>
-    <w:p>
-      <w:pPr>
-        <w:spacing w:before="40" w:after="40"/>
-      </w:pPr>
-      <w:r>
-        <w:rPr>
-          <w:rFonts w:ascii="맑은 고딕" w:hAnsi="맑은 고딕"/>
-          <w:b/>
-          <w:i w:val="0"/>
-          <w:color w:val="B42828"/>
-          <w:sz w:val="20"/>
-          <w:rFonts w:eastAsia="Microsoft YaHei" w:ascii="맑은 고딕"/>
-        </w:rPr>
-        <w:t xml:space="preserve">✏️ 예문  </w:t>
-      </w:r>
-      <w:r>
-        <w:rPr>
-          <w:rFonts w:ascii="Microsoft YaHei" w:hAnsi="Microsoft YaHei"/>
-          <w:b/>
-          <w:i w:val="0"/>
-          <w:color w:val="8C1E1E"/>
-          <w:sz w:val="21"/>
-          <w:rFonts w:eastAsia="Microsoft YaHei" w:ascii="Microsoft YaHei"/>
-        </w:rPr>
-        <w:t>经理一眼识破了他的谎言，让他非常尴尬。</w:t>
-      </w:r>
-    </w:p>
-    <w:p>
-      <w:pPr>
-        <w:spacing w:before="120" w:after="0"/>
-      </w:pPr>
-      <w:r>
-        <w:rPr>
-          <w:rFonts w:ascii="맑은 고딕" w:hAnsi="맑은 고딕"/>
-          <w:b w:val="0"/>
-          <w:i w:val="0"/>
-          <w:color w:val="C8C8C8"/>
-          <w:sz w:val="14"/>
-          <w:rFonts w:eastAsia="Microsoft YaHei" w:ascii="맑은 고딕"/>
-        </w:rPr>
-        <w:t>────────────────────────────────────────────────────────────</w:t>
-      </w:r>
-    </w:p>
-    <w:p>
-      <w:pPr>
-        <w:spacing w:before="200" w:after="40"/>
-      </w:pPr>
-      <w:r>
-        <w:rPr>
-          <w:rFonts w:ascii="맑은 고딕" w:hAnsi="맑은 고딕"/>
-          <w:b w:val="0"/>
-          <w:i w:val="0"/>
-          <w:color w:val="969696"/>
-          <w:sz w:val="20"/>
-          <w:rFonts w:eastAsia="Microsoft YaHei" w:ascii="맑은 고딕"/>
-        </w:rPr>
-        <w:t xml:space="preserve">011.  </w:t>
-      </w:r>
-      <w:r>
-        <w:rPr>
-          <w:rFonts w:ascii="Microsoft YaHei" w:hAnsi="Microsoft YaHei"/>
-          <w:b/>
-          <w:i w:val="0"/>
-          <w:color w:val="961414"/>
-          <w:sz w:val="28"/>
-          <w:rFonts w:eastAsia="Microsoft YaHei" w:ascii="Microsoft YaHei"/>
-        </w:rPr>
-        <w:t>拖欠</w:t>
-      </w:r>
-      <w:r>
-        <w:rPr>
-          <w:rFonts w:ascii="Calibri" w:hAnsi="Calibri"/>
-          <w:b w:val="0"/>
-          <w:i w:val="0"/>
-          <w:color w:val="787878"/>
-          <w:sz w:val="18"/>
-          <w:rFonts w:eastAsia="Microsoft YaHei" w:ascii="Calibri"/>
-        </w:rPr>
-        <w:t xml:space="preserve">   [VERB]</w:t>
-      </w:r>
-    </w:p>
-    <w:p>
-      <w:pPr>
-        <w:spacing w:before="0" w:after="40"/>
-      </w:pPr>
-      <w:r>
-        <w:rPr>
-          <w:rFonts w:ascii="맑은 고딕" w:hAnsi="맑은 고딕"/>
-          <w:b w:val="0"/>
-          <w:i w:val="0"/>
-          <w:sz w:val="20"/>
-          <w:rFonts w:eastAsia="Microsoft YaHei" w:ascii="맑은 고딕"/>
-        </w:rPr>
-        <w:t xml:space="preserve">🔊 </w:t>
-      </w:r>
-      <w:r>
-        <w:rPr>
-          <w:rFonts w:ascii="Calibri" w:hAnsi="Calibri"/>
-          <w:b w:val="0"/>
-          <w:i/>
-          <w:color w:val="505050"/>
-          <w:sz w:val="20"/>
-          <w:rFonts w:eastAsia="Microsoft YaHei" w:ascii="Calibri"/>
-        </w:rPr>
-        <w:t>tuō qiàn</w:t>
-      </w:r>
-    </w:p>
-    <w:p>
-      <w:pPr>
-        <w:spacing w:before="0" w:after="60"/>
-      </w:pPr>
-      <w:r>
-        <w:rPr>
-          <w:rFonts w:ascii="맑은 고딕" w:hAnsi="맑은 고딕"/>
-          <w:b/>
-          <w:i w:val="0"/>
-          <w:color w:val="282828"/>
-          <w:sz w:val="20"/>
-          <w:rFonts w:eastAsia="Microsoft YaHei" w:ascii="맑은 고딕"/>
-        </w:rPr>
-        <w:t xml:space="preserve">💡 의미  </w:t>
-      </w:r>
-      <w:r>
-        <w:rPr>
-          <w:rFonts w:ascii="맑은 고딕" w:hAnsi="맑은 고딕"/>
-          <w:b w:val="0"/>
-          <w:i w:val="0"/>
-          <w:sz w:val="21"/>
-          <w:rFonts w:eastAsia="Microsoft YaHei" w:ascii="맑은 고딕"/>
-        </w:rPr>
-        <w:t>체납하다, 밀리다 (빚, 요금 등)</w:t>
-      </w:r>
-    </w:p>
-    <w:p>
-      <w:pPr>
-        <w:spacing w:before="0" w:after="40"/>
-      </w:pPr>
-      <w:r>
-        <w:rPr>
-          <w:rFonts w:ascii="맑은 고딕" w:hAnsi="맑은 고딕"/>
-          <w:b/>
-          <w:i w:val="0"/>
-          <w:color w:val="646464"/>
-          <w:sz w:val="19"/>
-          <w:rFonts w:eastAsia="Microsoft YaHei" w:ascii="맑은 고딕"/>
-        </w:rPr>
-        <w:t xml:space="preserve">📌 원문  </w:t>
-      </w:r>
-      <w:r>
-        <w:rPr>
-          <w:rFonts w:ascii="Microsoft YaHei" w:hAnsi="Microsoft YaHei"/>
-          <w:b w:val="0"/>
-          <w:i/>
-          <w:color w:val="5A5A5A"/>
-          <w:sz w:val="19"/>
-          <w:rFonts w:eastAsia="Microsoft YaHei" w:ascii="Microsoft YaHei"/>
-        </w:rPr>
-        <w:t>"要求支付拖欠半年的租金"</w:t>
-      </w:r>
-    </w:p>
-    <w:p>
-      <w:pPr>
-        <w:spacing w:before="40" w:after="40"/>
-      </w:pPr>
-      <w:r>
-        <w:rPr>
-          <w:rFonts w:ascii="맑은 고딕" w:hAnsi="맑은 고딕"/>
-          <w:b/>
-          <w:i w:val="0"/>
-          <w:color w:val="B42828"/>
-          <w:sz w:val="20"/>
-          <w:rFonts w:eastAsia="Microsoft YaHei" w:ascii="맑은 고딕"/>
-        </w:rPr>
-        <w:t xml:space="preserve">✏️ 예문  </w:t>
-      </w:r>
-      <w:r>
-        <w:rPr>
-          <w:rFonts w:ascii="Microsoft YaHei" w:hAnsi="Microsoft YaHei"/>
-          <w:b/>
-          <w:i w:val="0"/>
-          <w:color w:val="8C1E1E"/>
-          <w:sz w:val="21"/>
-          <w:rFonts w:eastAsia="Microsoft YaHei" w:ascii="Microsoft YaHei"/>
-        </w:rPr>
-        <w:t>如果你继续拖欠房租，房东可能会采取法律行动。</w:t>
-      </w:r>
-    </w:p>
-    <w:p>
-      <w:pPr>
-        <w:spacing w:before="120" w:after="0"/>
-      </w:pPr>
-      <w:r>
-        <w:rPr>
-          <w:rFonts w:ascii="맑은 고딕" w:hAnsi="맑은 고딕"/>
-          <w:b w:val="0"/>
-          <w:i w:val="0"/>
-          <w:color w:val="C8C8C8"/>
-          <w:sz w:val="14"/>
-          <w:rFonts w:eastAsia="Microsoft YaHei" w:ascii="맑은 고딕"/>
-        </w:rPr>
-        <w:t>────────────────────────────────────────────────────────────</w:t>
-      </w:r>
-    </w:p>
-    <w:p>
-      <w:pPr>
-        <w:spacing w:before="200" w:after="40"/>
-      </w:pPr>
-      <w:r>
-        <w:rPr>
-          <w:rFonts w:ascii="맑은 고딕" w:hAnsi="맑은 고딕"/>
-          <w:b w:val="0"/>
-          <w:i w:val="0"/>
-          <w:color w:val="969696"/>
-          <w:sz w:val="20"/>
-          <w:rFonts w:eastAsia="Microsoft YaHei" w:ascii="맑은 고딕"/>
-        </w:rPr>
-        <w:t xml:space="preserve">012.  </w:t>
-      </w:r>
-      <w:r>
-        <w:rPr>
-          <w:rFonts w:ascii="Microsoft YaHei" w:hAnsi="Microsoft YaHei"/>
-          <w:b/>
-          <w:i w:val="0"/>
-          <w:color w:val="961414"/>
-          <w:sz w:val="28"/>
-          <w:rFonts w:eastAsia="Microsoft YaHei" w:ascii="Microsoft YaHei"/>
-        </w:rPr>
-        <w:t>刷屏</w:t>
-      </w:r>
-      <w:r>
-        <w:rPr>
-          <w:rFonts w:ascii="Calibri" w:hAnsi="Calibri"/>
-          <w:b w:val="0"/>
-          <w:i w:val="0"/>
-          <w:color w:val="787878"/>
-          <w:sz w:val="18"/>
-          <w:rFonts w:eastAsia="Microsoft YaHei" w:ascii="Calibri"/>
-        </w:rPr>
-        <w:t xml:space="preserve">   [SEPARABLE VERB / COLLOQUIALISM]</w:t>
-      </w:r>
-    </w:p>
-    <w:p>
-      <w:pPr>
-        <w:spacing w:before="0" w:after="40"/>
-      </w:pPr>
-      <w:r>
-        <w:rPr>
-          <w:rFonts w:ascii="맑은 고딕" w:hAnsi="맑은 고딕"/>
-          <w:b w:val="0"/>
-          <w:i w:val="0"/>
-          <w:sz w:val="20"/>
-          <w:rFonts w:eastAsia="Microsoft YaHei" w:ascii="맑은 고딕"/>
-        </w:rPr>
-        <w:t xml:space="preserve">🔊 </w:t>
-      </w:r>
-      <w:r>
-        <w:rPr>
-          <w:rFonts w:ascii="Calibri" w:hAnsi="Calibri"/>
-          <w:b w:val="0"/>
-          <w:i/>
-          <w:color w:val="505050"/>
-          <w:sz w:val="20"/>
-          <w:rFonts w:eastAsia="Microsoft YaHei" w:ascii="Calibri"/>
-        </w:rPr>
-        <w:t>shuā píng</w:t>
-      </w:r>
-    </w:p>
-    <w:p>
-      <w:pPr>
-        <w:spacing w:before="0" w:after="60"/>
-      </w:pPr>
-      <w:r>
-        <w:rPr>
-          <w:rFonts w:ascii="맑은 고딕" w:hAnsi="맑은 고딕"/>
-          <w:b/>
-          <w:i w:val="0"/>
-          <w:color w:val="282828"/>
-          <w:sz w:val="20"/>
-          <w:rFonts w:eastAsia="Microsoft YaHei" w:ascii="맑은 고딕"/>
-        </w:rPr>
-        <w:t xml:space="preserve">💡 의미  </w:t>
-      </w:r>
-      <w:r>
-        <w:rPr>
-          <w:rFonts w:ascii="맑은 고딕" w:hAnsi="맑은 고딕"/>
-          <w:b w:val="0"/>
-          <w:i w:val="0"/>
-          <w:sz w:val="21"/>
-          <w:rFonts w:eastAsia="Microsoft YaHei" w:ascii="맑은 고딕"/>
-        </w:rPr>
-        <w:t>(SNS 등에서) 화면을 도배하다, (정보가) 쇄도하다, (인터넷에서) 화제가 되다</w:t>
-      </w:r>
-    </w:p>
-    <w:p>
-      <w:pPr>
-        <w:spacing w:before="0" w:after="40"/>
-      </w:pPr>
-      <w:r>
-        <w:rPr>
-          <w:rFonts w:ascii="맑은 고딕" w:hAnsi="맑은 고딕"/>
-          <w:b/>
-          <w:i w:val="0"/>
-          <w:color w:val="646464"/>
-          <w:sz w:val="19"/>
-          <w:rFonts w:eastAsia="Microsoft YaHei" w:ascii="맑은 고딕"/>
-        </w:rPr>
-        <w:t xml:space="preserve">📌 원문  </w:t>
-      </w:r>
-      <w:r>
-        <w:rPr>
-          <w:rFonts w:ascii="Microsoft YaHei" w:hAnsi="Microsoft YaHei"/>
-          <w:b w:val="0"/>
-          <w:i/>
-          <w:color w:val="5A5A5A"/>
-          <w:sz w:val="19"/>
-          <w:rFonts w:eastAsia="Microsoft YaHei" w:ascii="Microsoft YaHei"/>
-        </w:rPr>
-        <w:t>"留学圈被一所“年轻”的美高刷屏了"</w:t>
-      </w:r>
-    </w:p>
-    <w:p>
-      <w:pPr>
-        <w:spacing w:before="40" w:after="40"/>
-      </w:pPr>
-      <w:r>
-        <w:rPr>
-          <w:rFonts w:ascii="맑은 고딕" w:hAnsi="맑은 고딕"/>
-          <w:b/>
-          <w:i w:val="0"/>
-          <w:color w:val="B42828"/>
-          <w:sz w:val="20"/>
-          <w:rFonts w:eastAsia="Microsoft YaHei" w:ascii="맑은 고딕"/>
-        </w:rPr>
-        <w:t xml:space="preserve">✏️ 예문  </w:t>
-      </w:r>
-      <w:r>
-        <w:rPr>
-          <w:rFonts w:ascii="Microsoft YaHei" w:hAnsi="Microsoft YaHei"/>
-          <w:b/>
-          <w:i w:val="0"/>
-          <w:color w:val="8C1E1E"/>
-          <w:sz w:val="21"/>
-          <w:rFonts w:eastAsia="Microsoft YaHei" w:ascii="Microsoft YaHei"/>
-        </w:rPr>
-        <w:t>昨晚那部电影太火了，我的朋友圈都被刷屏了。</w:t>
-      </w:r>
-    </w:p>
-    <w:p>
-      <w:pPr>
-        <w:spacing w:before="120" w:after="0"/>
-      </w:pPr>
-      <w:r>
-        <w:rPr>
-          <w:rFonts w:ascii="맑은 고딕" w:hAnsi="맑은 고딕"/>
-          <w:b w:val="0"/>
-          <w:i w:val="0"/>
-          <w:color w:val="C8C8C8"/>
-          <w:sz w:val="14"/>
-          <w:rFonts w:eastAsia="Microsoft YaHei" w:ascii="맑은 고딕"/>
-        </w:rPr>
-        <w:t>────────────────────────────────────────────────────────────</w:t>
-      </w:r>
-    </w:p>
-    <w:p>
-      <w:pPr>
-        <w:spacing w:before="200" w:after="40"/>
-      </w:pPr>
-      <w:r>
-        <w:rPr>
-          <w:rFonts w:ascii="맑은 고딕" w:hAnsi="맑은 고딕"/>
-          <w:b w:val="0"/>
-          <w:i w:val="0"/>
-          <w:color w:val="969696"/>
-          <w:sz w:val="20"/>
-          <w:rFonts w:eastAsia="Microsoft YaHei" w:ascii="맑은 고딕"/>
-        </w:rPr>
-        <w:t xml:space="preserve">013.  </w:t>
-      </w:r>
-      <w:r>
-        <w:rPr>
-          <w:rFonts w:ascii="Microsoft YaHei" w:hAnsi="Microsoft YaHei"/>
-          <w:b/>
-          <w:i w:val="0"/>
-          <w:color w:val="961414"/>
-          <w:sz w:val="28"/>
-          <w:rFonts w:eastAsia="Microsoft YaHei" w:ascii="Microsoft YaHei"/>
-        </w:rPr>
-        <w:t>小升初</w:t>
-      </w:r>
-      <w:r>
-        <w:rPr>
-          <w:rFonts w:ascii="Calibri" w:hAnsi="Calibri"/>
-          <w:b w:val="0"/>
-          <w:i w:val="0"/>
-          <w:color w:val="787878"/>
-          <w:sz w:val="18"/>
-          <w:rFonts w:eastAsia="Microsoft YaHei" w:ascii="Calibri"/>
-        </w:rPr>
-        <w:t xml:space="preserve">   [COLLOQUIALISM (ABBREVIATION)]</w:t>
-      </w:r>
-    </w:p>
-    <w:p>
-      <w:pPr>
-        <w:spacing w:before="0" w:after="40"/>
-      </w:pPr>
-      <w:r>
-        <w:rPr>
-          <w:rFonts w:ascii="맑은 고딕" w:hAnsi="맑은 고딕"/>
-          <w:b w:val="0"/>
-          <w:i w:val="0"/>
-          <w:sz w:val="20"/>
-          <w:rFonts w:eastAsia="Microsoft YaHei" w:ascii="맑은 고딕"/>
-        </w:rPr>
-        <w:t xml:space="preserve">🔊 </w:t>
-      </w:r>
-      <w:r>
-        <w:rPr>
-          <w:rFonts w:ascii="Calibri" w:hAnsi="Calibri"/>
-          <w:b w:val="0"/>
-          <w:i/>
-          <w:color w:val="505050"/>
-          <w:sz w:val="20"/>
-          <w:rFonts w:eastAsia="Microsoft YaHei" w:ascii="Calibri"/>
-        </w:rPr>
-        <w:t>xiǎo shēng chū</w:t>
-      </w:r>
-    </w:p>
-    <w:p>
-      <w:pPr>
-        <w:spacing w:before="0" w:after="60"/>
-      </w:pPr>
-      <w:r>
-        <w:rPr>
-          <w:rFonts w:ascii="맑은 고딕" w:hAnsi="맑은 고딕"/>
-          <w:b/>
-          <w:i w:val="0"/>
-          <w:color w:val="282828"/>
-          <w:sz w:val="20"/>
-          <w:rFonts w:eastAsia="Microsoft YaHei" w:ascii="맑은 고딕"/>
-        </w:rPr>
-        <w:t xml:space="preserve">💡 의미  </w:t>
-      </w:r>
-      <w:r>
-        <w:rPr>
-          <w:rFonts w:ascii="맑은 고딕" w:hAnsi="맑은 고딕"/>
-          <w:b w:val="0"/>
-          <w:i w:val="0"/>
-          <w:sz w:val="21"/>
-          <w:rFonts w:eastAsia="Microsoft YaHei" w:ascii="맑은 고딕"/>
-        </w:rPr>
-        <w:t>초등학교에서 중학교로 진학</w:t>
-      </w:r>
-    </w:p>
-    <w:p>
-      <w:pPr>
-        <w:spacing w:before="0" w:after="40"/>
-      </w:pPr>
-      <w:r>
-        <w:rPr>
-          <w:rFonts w:ascii="맑은 고딕" w:hAnsi="맑은 고딕"/>
-          <w:b/>
-          <w:i w:val="0"/>
-          <w:color w:val="646464"/>
-          <w:sz w:val="19"/>
-          <w:rFonts w:eastAsia="Microsoft YaHei" w:ascii="맑은 고딕"/>
-        </w:rPr>
-        <w:t xml:space="preserve">📌 원문  </w:t>
-      </w:r>
-      <w:r>
-        <w:rPr>
-          <w:rFonts w:ascii="Microsoft YaHei" w:hAnsi="Microsoft YaHei"/>
-          <w:b w:val="0"/>
-          <w:i/>
-          <w:color w:val="5A5A5A"/>
-          <w:sz w:val="19"/>
-          <w:rFonts w:eastAsia="Microsoft YaHei" w:ascii="Microsoft YaHei"/>
-        </w:rPr>
-        <w:t>"小升初5月22日报名！"</w:t>
-      </w:r>
-    </w:p>
-    <w:p>
-      <w:pPr>
-        <w:spacing w:before="40" w:after="40"/>
-      </w:pPr>
-      <w:r>
-        <w:rPr>
-          <w:rFonts w:ascii="맑은 고딕" w:hAnsi="맑은 고딕"/>
-          <w:b/>
-          <w:i w:val="0"/>
-          <w:color w:val="B42828"/>
-          <w:sz w:val="20"/>
-          <w:rFonts w:eastAsia="Microsoft YaHei" w:ascii="맑은 고딕"/>
-        </w:rPr>
-        <w:t xml:space="preserve">✏️ 예문  </w:t>
-      </w:r>
-      <w:r>
-        <w:rPr>
-          <w:rFonts w:ascii="Microsoft YaHei" w:hAnsi="Microsoft YaHei"/>
-          <w:b/>
-          <w:i w:val="0"/>
-          <w:color w:val="8C1E1E"/>
-          <w:sz w:val="21"/>
-          <w:rFonts w:eastAsia="Microsoft YaHei" w:ascii="Microsoft YaHei"/>
-        </w:rPr>
-        <w:t>很多家长为了孩子的小升初，提前几年就开始准备了。</w:t>
-      </w:r>
-    </w:p>
-    <w:p>
-      <w:pPr>
-        <w:spacing w:before="120" w:after="0"/>
-      </w:pPr>
-      <w:r>
-        <w:rPr>
-          <w:rFonts w:ascii="맑은 고딕" w:hAnsi="맑은 고딕"/>
-          <w:b w:val="0"/>
-          <w:i w:val="0"/>
-          <w:color w:val="C8C8C8"/>
-          <w:sz w:val="14"/>
-          <w:rFonts w:eastAsia="Microsoft YaHei" w:ascii="맑은 고딕"/>
-        </w:rPr>
-        <w:t>────────────────────────────────────────────────────────────</w:t>
-      </w:r>
-    </w:p>
-    <w:p>
-      <w:pPr>
-        <w:spacing w:before="200" w:after="40"/>
-      </w:pPr>
-      <w:r>
-        <w:rPr>
-          <w:rFonts w:ascii="맑은 고딕" w:hAnsi="맑은 고딕"/>
-          <w:b w:val="0"/>
-          <w:i w:val="0"/>
-          <w:color w:val="969696"/>
-          <w:sz w:val="20"/>
-          <w:rFonts w:eastAsia="Microsoft YaHei" w:ascii="맑은 고딕"/>
-        </w:rPr>
-        <w:t xml:space="preserve">014.  </w:t>
-      </w:r>
-      <w:r>
-        <w:rPr>
-          <w:rFonts w:ascii="Microsoft YaHei" w:hAnsi="Microsoft YaHei"/>
-          <w:b/>
-          <w:i w:val="0"/>
-          <w:color w:val="961414"/>
-          <w:sz w:val="28"/>
-          <w:rFonts w:eastAsia="Microsoft YaHei" w:ascii="Microsoft YaHei"/>
-        </w:rPr>
-        <w:t>全员开挂</w:t>
-      </w:r>
-      <w:r>
-        <w:rPr>
-          <w:rFonts w:ascii="Calibri" w:hAnsi="Calibri"/>
-          <w:b w:val="0"/>
-          <w:i w:val="0"/>
-          <w:color w:val="787878"/>
-          <w:sz w:val="18"/>
-          <w:rFonts w:eastAsia="Microsoft YaHei" w:ascii="Calibri"/>
-        </w:rPr>
-        <w:t xml:space="preserve">   [COLLOQUIALISM]</w:t>
-      </w:r>
-    </w:p>
-    <w:p>
-      <w:pPr>
-        <w:spacing w:before="0" w:after="40"/>
-      </w:pPr>
-      <w:r>
-        <w:rPr>
-          <w:rFonts w:ascii="맑은 고딕" w:hAnsi="맑은 고딕"/>
-          <w:b w:val="0"/>
-          <w:i w:val="0"/>
-          <w:sz w:val="20"/>
-          <w:rFonts w:eastAsia="Microsoft YaHei" w:ascii="맑은 고딕"/>
-        </w:rPr>
-        <w:t xml:space="preserve">🔊 </w:t>
-      </w:r>
-      <w:r>
-        <w:rPr>
-          <w:rFonts w:ascii="Calibri" w:hAnsi="Calibri"/>
-          <w:b w:val="0"/>
-          <w:i/>
-          <w:color w:val="505050"/>
-          <w:sz w:val="20"/>
-          <w:rFonts w:eastAsia="Microsoft YaHei" w:ascii="Calibri"/>
-        </w:rPr>
-        <w:t>quán yuán kāi guà</w:t>
-      </w:r>
-    </w:p>
-    <w:p>
-      <w:pPr>
-        <w:spacing w:before="0" w:after="60"/>
-      </w:pPr>
-      <w:r>
-        <w:rPr>
-          <w:rFonts w:ascii="맑은 고딕" w:hAnsi="맑은 고딕"/>
-          <w:b/>
-          <w:i w:val="0"/>
-          <w:color w:val="282828"/>
-          <w:sz w:val="20"/>
-          <w:rFonts w:eastAsia="Microsoft YaHei" w:ascii="맑은 고딕"/>
-        </w:rPr>
-        <w:t xml:space="preserve">💡 의미  </w:t>
-      </w:r>
-      <w:r>
-        <w:rPr>
-          <w:rFonts w:ascii="맑은 고딕" w:hAnsi="맑은 고딕"/>
-          <w:b w:val="0"/>
-          <w:i w:val="0"/>
-          <w:sz w:val="21"/>
-          <w:rFonts w:eastAsia="Microsoft YaHei" w:ascii="맑은 고딕"/>
-        </w:rPr>
-        <w:t>전원 (게임에서) 치트키를 쓰다; 전원이 엄청난 실력을 발휘하다</w:t>
-      </w:r>
-    </w:p>
-    <w:p>
-      <w:pPr>
-        <w:spacing w:before="0" w:after="40"/>
-      </w:pPr>
-      <w:r>
-        <w:rPr>
-          <w:rFonts w:ascii="맑은 고딕" w:hAnsi="맑은 고딕"/>
-          <w:b/>
-          <w:i w:val="0"/>
-          <w:color w:val="646464"/>
-          <w:sz w:val="19"/>
-          <w:rFonts w:eastAsia="Microsoft YaHei" w:ascii="맑은 고딕"/>
-        </w:rPr>
-        <w:t xml:space="preserve">📌 원문  </w:t>
-      </w:r>
-      <w:r>
-        <w:rPr>
-          <w:rFonts w:ascii="Microsoft YaHei" w:hAnsi="Microsoft YaHei"/>
-          <w:b w:val="0"/>
-          <w:i/>
-          <w:color w:val="5A5A5A"/>
-          <w:sz w:val="19"/>
-          <w:rFonts w:eastAsia="Microsoft YaHei" w:ascii="Microsoft YaHei"/>
-        </w:rPr>
-        <w:t>"全员开挂：100%获得美国前30大学录取"</w:t>
-      </w:r>
-    </w:p>
-    <w:p>
-      <w:pPr>
-        <w:spacing w:before="40" w:after="40"/>
-      </w:pPr>
-      <w:r>
-        <w:rPr>
-          <w:rFonts w:ascii="맑은 고딕" w:hAnsi="맑은 고딕"/>
-          <w:b/>
-          <w:i w:val="0"/>
-          <w:color w:val="B42828"/>
-          <w:sz w:val="20"/>
-          <w:rFonts w:eastAsia="Microsoft YaHei" w:ascii="맑은 고딕"/>
-        </w:rPr>
-        <w:t xml:space="preserve">✏️ 예문  </w:t>
-      </w:r>
-      <w:r>
-        <w:rPr>
-          <w:rFonts w:ascii="Microsoft YaHei" w:hAnsi="Microsoft YaHei"/>
-          <w:b/>
-          <w:i w:val="0"/>
-          <w:color w:val="8C1E1E"/>
-          <w:sz w:val="21"/>
-          <w:rFonts w:eastAsia="Microsoft YaHei" w:ascii="Microsoft YaHei"/>
-        </w:rPr>
-        <w:t>我们团队这次项目表现太出色了，简直是全员开挂！</w:t>
-      </w:r>
-    </w:p>
-    <w:p>
-      <w:pPr>
-        <w:spacing w:before="120" w:after="0"/>
-      </w:pPr>
-      <w:r>
-        <w:rPr>
-          <w:rFonts w:ascii="맑은 고딕" w:hAnsi="맑은 고딕"/>
-          <w:b w:val="0"/>
-          <w:i w:val="0"/>
-          <w:color w:val="C8C8C8"/>
-          <w:sz w:val="14"/>
-          <w:rFonts w:eastAsia="Microsoft YaHei" w:ascii="맑은 고딕"/>
-        </w:rPr>
-        <w:t>────────────────────────────────────────────────────────────</w:t>
-      </w:r>
-    </w:p>
-    <w:p>
-      <w:pPr>
-        <w:spacing w:before="200" w:after="40"/>
-      </w:pPr>
-      <w:r>
-        <w:rPr>
-          <w:rFonts w:ascii="맑은 고딕" w:hAnsi="맑은 고딕"/>
-          <w:b w:val="0"/>
-          <w:i w:val="0"/>
-          <w:color w:val="969696"/>
-          <w:sz w:val="20"/>
-          <w:rFonts w:eastAsia="Microsoft YaHei" w:ascii="맑은 고딕"/>
-        </w:rPr>
-        <w:t xml:space="preserve">015.  </w:t>
-      </w:r>
-      <w:r>
-        <w:rPr>
-          <w:rFonts w:ascii="Microsoft YaHei" w:hAnsi="Microsoft YaHei"/>
-          <w:b/>
-          <w:i w:val="0"/>
-          <w:color w:val="961414"/>
-          <w:sz w:val="28"/>
-          <w:rFonts w:eastAsia="Microsoft YaHei" w:ascii="Microsoft YaHei"/>
-        </w:rPr>
-        <w:t>十年磨一剑</w:t>
-      </w:r>
-      <w:r>
-        <w:rPr>
-          <w:rFonts w:ascii="Calibri" w:hAnsi="Calibri"/>
-          <w:b w:val="0"/>
-          <w:i w:val="0"/>
-          <w:color w:val="787878"/>
-          <w:sz w:val="18"/>
-          <w:rFonts w:eastAsia="Microsoft YaHei" w:ascii="Calibri"/>
-        </w:rPr>
-        <w:t xml:space="preserve">   [IDIOM]</w:t>
-      </w:r>
-    </w:p>
-    <w:p>
-      <w:pPr>
-        <w:spacing w:before="0" w:after="40"/>
-      </w:pPr>
-      <w:r>
-        <w:rPr>
-          <w:rFonts w:ascii="맑은 고딕" w:hAnsi="맑은 고딕"/>
-          <w:b w:val="0"/>
-          <w:i w:val="0"/>
-          <w:sz w:val="20"/>
-          <w:rFonts w:eastAsia="Microsoft YaHei" w:ascii="맑은 고딕"/>
-        </w:rPr>
-        <w:t xml:space="preserve">🔊 </w:t>
-      </w:r>
-      <w:r>
-        <w:rPr>
-          <w:rFonts w:ascii="Calibri" w:hAnsi="Calibri"/>
-          <w:b w:val="0"/>
-          <w:i/>
-          <w:color w:val="505050"/>
-          <w:sz w:val="20"/>
-          <w:rFonts w:eastAsia="Microsoft YaHei" w:ascii="Calibri"/>
-        </w:rPr>
-        <w:t>shí nián mó yī jiàn</w:t>
-      </w:r>
-    </w:p>
-    <w:p>
-      <w:pPr>
-        <w:spacing w:before="0" w:after="60"/>
-      </w:pPr>
-      <w:r>
-        <w:rPr>
-          <w:rFonts w:ascii="맑은 고딕" w:hAnsi="맑은 고딕"/>
-          <w:b/>
-          <w:i w:val="0"/>
-          <w:color w:val="282828"/>
-          <w:sz w:val="20"/>
-          <w:rFonts w:eastAsia="Microsoft YaHei" w:ascii="맑은 고딕"/>
-        </w:rPr>
-        <w:t xml:space="preserve">💡 의미  </w:t>
-      </w:r>
-      <w:r>
-        <w:rPr>
-          <w:rFonts w:ascii="맑은 고딕" w:hAnsi="맑은 고딕"/>
-          <w:b w:val="0"/>
-          <w:i w:val="0"/>
-          <w:sz w:val="21"/>
-          <w:rFonts w:eastAsia="Microsoft YaHei" w:ascii="맑은 고딕"/>
-        </w:rPr>
-        <w:t>끈기 있는 노력으로 실력을 연마하다; 오랜 시간 공들여 준비하다</w:t>
-      </w:r>
-    </w:p>
-    <w:p>
-      <w:pPr>
-        <w:spacing w:before="0" w:after="40"/>
-      </w:pPr>
-      <w:r>
-        <w:rPr>
-          <w:rFonts w:ascii="맑은 고딕" w:hAnsi="맑은 고딕"/>
-          <w:b/>
-          <w:i w:val="0"/>
-          <w:color w:val="646464"/>
-          <w:sz w:val="19"/>
-          <w:rFonts w:eastAsia="Microsoft YaHei" w:ascii="맑은 고딕"/>
-        </w:rPr>
-        <w:t xml:space="preserve">📌 원문  </w:t>
-      </w:r>
-      <w:r>
-        <w:rPr>
-          <w:rFonts w:ascii="Microsoft YaHei" w:hAnsi="Microsoft YaHei"/>
-          <w:b w:val="0"/>
-          <w:i/>
-          <w:color w:val="5A5A5A"/>
-          <w:sz w:val="19"/>
-          <w:rFonts w:eastAsia="Microsoft YaHei" w:ascii="Microsoft YaHei"/>
-        </w:rPr>
-        <w:t>"十年磨一剑！神仙学校给你稳稳的幸福."</w:t>
-      </w:r>
-    </w:p>
-    <w:p>
-      <w:pPr>
-        <w:spacing w:before="40" w:after="40"/>
-      </w:pPr>
-      <w:r>
-        <w:rPr>
-          <w:rFonts w:ascii="맑은 고딕" w:hAnsi="맑은 고딕"/>
-          <w:b/>
-          <w:i w:val="0"/>
-          <w:color w:val="B42828"/>
-          <w:sz w:val="20"/>
-          <w:rFonts w:eastAsia="Microsoft YaHei" w:ascii="맑은 고딕"/>
-        </w:rPr>
-        <w:t xml:space="preserve">✏️ 예문  </w:t>
-      </w:r>
-      <w:r>
-        <w:rPr>
-          <w:rFonts w:ascii="Microsoft YaHei" w:hAnsi="Microsoft YaHei"/>
-          <w:b/>
-          <w:i w:val="0"/>
-          <w:color w:val="8C1E1E"/>
-          <w:sz w:val="21"/>
-          <w:rFonts w:eastAsia="Microsoft YaHei" w:ascii="Microsoft YaHei"/>
-        </w:rPr>
-        <w:t>我们的团队为了这个项目十年磨一剑，终于取得了突破性进展。</w:t>
-      </w:r>
-    </w:p>
-    <w:p>
-      <w:pPr>
-        <w:spacing w:before="120" w:after="0"/>
-      </w:pPr>
-      <w:r>
-        <w:rPr>
-          <w:rFonts w:ascii="맑은 고딕" w:hAnsi="맑은 고딕"/>
-          <w:b w:val="0"/>
-          <w:i w:val="0"/>
-          <w:color w:val="C8C8C8"/>
-          <w:sz w:val="14"/>
-          <w:rFonts w:eastAsia="Microsoft YaHei" w:ascii="맑은 고딕"/>
-        </w:rPr>
-        <w:t>────────────────────────────────────────────────────────────</w:t>
-      </w:r>
-    </w:p>
-    <w:p>
-      <w:pPr>
-        <w:spacing w:before="200" w:after="40"/>
-      </w:pPr>
-      <w:r>
-        <w:rPr>
-          <w:rFonts w:ascii="맑은 고딕" w:hAnsi="맑은 고딕"/>
-          <w:b w:val="0"/>
-          <w:i w:val="0"/>
-          <w:color w:val="969696"/>
-          <w:sz w:val="20"/>
-          <w:rFonts w:eastAsia="Microsoft YaHei" w:ascii="맑은 고딕"/>
-        </w:rPr>
-        <w:t xml:space="preserve">016.  </w:t>
-      </w:r>
-      <w:r>
-        <w:rPr>
-          <w:rFonts w:ascii="Microsoft YaHei" w:hAnsi="Microsoft YaHei"/>
-          <w:b/>
-          <w:i w:val="0"/>
-          <w:color w:val="961414"/>
-          <w:sz w:val="28"/>
-          <w:rFonts w:eastAsia="Microsoft YaHei" w:ascii="Microsoft YaHei"/>
-        </w:rPr>
-        <w:t>变废为宝</w:t>
-      </w:r>
-      <w:r>
-        <w:rPr>
-          <w:rFonts w:ascii="Calibri" w:hAnsi="Calibri"/>
-          <w:b w:val="0"/>
-          <w:i w:val="0"/>
-          <w:color w:val="787878"/>
-          <w:sz w:val="18"/>
-          <w:rFonts w:eastAsia="Microsoft YaHei" w:ascii="Calibri"/>
-        </w:rPr>
-        <w:t xml:space="preserve">   [IDIOM]</w:t>
-      </w:r>
-    </w:p>
-    <w:p>
-      <w:pPr>
-        <w:spacing w:before="0" w:after="40"/>
-      </w:pPr>
-      <w:r>
-        <w:rPr>
-          <w:rFonts w:ascii="맑은 고딕" w:hAnsi="맑은 고딕"/>
-          <w:b w:val="0"/>
-          <w:i w:val="0"/>
-          <w:sz w:val="20"/>
-          <w:rFonts w:eastAsia="Microsoft YaHei" w:ascii="맑은 고딕"/>
-        </w:rPr>
-        <w:t xml:space="preserve">🔊 </w:t>
-      </w:r>
-      <w:r>
-        <w:rPr>
-          <w:rFonts w:ascii="Calibri" w:hAnsi="Calibri"/>
-          <w:b w:val="0"/>
-          <w:i/>
-          <w:color w:val="505050"/>
-          <w:sz w:val="20"/>
-          <w:rFonts w:eastAsia="Microsoft YaHei" w:ascii="Calibri"/>
-        </w:rPr>
-        <w:t>biànfèiwéibǎo</w:t>
-      </w:r>
-    </w:p>
-    <w:p>
-      <w:pPr>
-        <w:spacing w:before="0" w:after="60"/>
-      </w:pPr>
-      <w:r>
-        <w:rPr>
-          <w:rFonts w:ascii="맑은 고딕" w:hAnsi="맑은 고딕"/>
-          <w:b/>
-          <w:i w:val="0"/>
-          <w:color w:val="282828"/>
-          <w:sz w:val="20"/>
-          <w:rFonts w:eastAsia="Microsoft YaHei" w:ascii="맑은 고딕"/>
-        </w:rPr>
-        <w:t xml:space="preserve">💡 의미  </w:t>
-      </w:r>
-      <w:r>
-        <w:rPr>
-          <w:rFonts w:ascii="맑은 고딕" w:hAnsi="맑은 고딕"/>
-          <w:b w:val="0"/>
-          <w:i w:val="0"/>
-          <w:sz w:val="21"/>
-          <w:rFonts w:eastAsia="Microsoft YaHei" w:ascii="맑은 고딕"/>
-        </w:rPr>
-        <w:t>폐품을 보물로 만들다; 재활용하다</w:t>
-      </w:r>
-    </w:p>
-    <w:p>
-      <w:pPr>
-        <w:spacing w:before="0" w:after="40"/>
-      </w:pPr>
-      <w:r>
-        <w:rPr>
-          <w:rFonts w:ascii="맑은 고딕" w:hAnsi="맑은 고딕"/>
-          <w:b/>
-          <w:i w:val="0"/>
-          <w:color w:val="646464"/>
-          <w:sz w:val="19"/>
-          <w:rFonts w:eastAsia="Microsoft YaHei" w:ascii="맑은 고딕"/>
-        </w:rPr>
-        <w:t xml:space="preserve">📌 원문  </w:t>
-      </w:r>
-      <w:r>
-        <w:rPr>
-          <w:rFonts w:ascii="Microsoft YaHei" w:hAnsi="Microsoft YaHei"/>
-          <w:b w:val="0"/>
-          <w:i/>
-          <w:color w:val="5A5A5A"/>
-          <w:sz w:val="19"/>
-          <w:rFonts w:eastAsia="Microsoft YaHei" w:ascii="Microsoft YaHei"/>
-        </w:rPr>
-        <w:t>"它就藏在变废为宝的巧思里"</w:t>
-      </w:r>
-    </w:p>
-    <w:p>
-      <w:pPr>
-        <w:spacing w:before="40" w:after="40"/>
-      </w:pPr>
-      <w:r>
-        <w:rPr>
-          <w:rFonts w:ascii="맑은 고딕" w:hAnsi="맑은 고딕"/>
-          <w:b/>
-          <w:i w:val="0"/>
-          <w:color w:val="B42828"/>
-          <w:sz w:val="20"/>
-          <w:rFonts w:eastAsia="Microsoft YaHei" w:ascii="맑은 고딕"/>
-        </w:rPr>
-        <w:t xml:space="preserve">✏️ 예문  </w:t>
-      </w:r>
-      <w:r>
-        <w:rPr>
-          <w:rFonts w:ascii="Microsoft YaHei" w:hAnsi="Microsoft YaHei"/>
-          <w:b/>
-          <w:i w:val="0"/>
-          <w:color w:val="8C1E1E"/>
-          <w:sz w:val="21"/>
-          <w:rFonts w:eastAsia="Microsoft YaHei" w:ascii="Microsoft YaHei"/>
-        </w:rPr>
-        <w:t>公司鼓励员工将旧文件变废为宝，制作成创意办公用品。</w:t>
-      </w:r>
-    </w:p>
-    <w:p>
-      <w:pPr>
-        <w:spacing w:before="120" w:after="0"/>
-      </w:pPr>
-      <w:r>
-        <w:rPr>
-          <w:rFonts w:ascii="맑은 고딕" w:hAnsi="맑은 고딕"/>
-          <w:b w:val="0"/>
-          <w:i w:val="0"/>
-          <w:color w:val="C8C8C8"/>
-          <w:sz w:val="14"/>
-          <w:rFonts w:eastAsia="Microsoft YaHei" w:ascii="맑은 고딕"/>
-        </w:rPr>
-        <w:t>────────────────────────────────────────────────────────────</w:t>
-      </w:r>
-    </w:p>
-    <w:p>
-      <w:pPr>
-        <w:spacing w:before="200" w:after="40"/>
-      </w:pPr>
-      <w:r>
-        <w:rPr>
-          <w:rFonts w:ascii="맑은 고딕" w:hAnsi="맑은 고딕"/>
-          <w:b w:val="0"/>
-          <w:i w:val="0"/>
-          <w:color w:val="969696"/>
-          <w:sz w:val="20"/>
-          <w:rFonts w:eastAsia="Microsoft YaHei" w:ascii="맑은 고딕"/>
-        </w:rPr>
-        <w:t xml:space="preserve">017.  </w:t>
-      </w:r>
-      <w:r>
-        <w:rPr>
-          <w:rFonts w:ascii="Microsoft YaHei" w:hAnsi="Microsoft YaHei"/>
-          <w:b/>
-          <w:i w:val="0"/>
-          <w:color w:val="961414"/>
-          <w:sz w:val="28"/>
-          <w:rFonts w:eastAsia="Microsoft YaHei" w:ascii="Microsoft YaHei"/>
-        </w:rPr>
-        <w:t>打卡</w:t>
-      </w:r>
-      <w:r>
-        <w:rPr>
-          <w:rFonts w:ascii="Calibri" w:hAnsi="Calibri"/>
-          <w:b w:val="0"/>
-          <w:i w:val="0"/>
-          <w:color w:val="787878"/>
-          <w:sz w:val="18"/>
-          <w:rFonts w:eastAsia="Microsoft YaHei" w:ascii="Calibri"/>
-        </w:rPr>
-        <w:t xml:space="preserve">   [COLLOQUIALISM]</w:t>
-      </w:r>
-    </w:p>
-    <w:p>
-      <w:pPr>
-        <w:spacing w:before="0" w:after="40"/>
-      </w:pPr>
-      <w:r>
-        <w:rPr>
-          <w:rFonts w:ascii="맑은 고딕" w:hAnsi="맑은 고딕"/>
-          <w:b w:val="0"/>
-          <w:i w:val="0"/>
-          <w:sz w:val="20"/>
-          <w:rFonts w:eastAsia="Microsoft YaHei" w:ascii="맑은 고딕"/>
-        </w:rPr>
-        <w:t xml:space="preserve">🔊 </w:t>
-      </w:r>
-      <w:r>
-        <w:rPr>
-          <w:rFonts w:ascii="Calibri" w:hAnsi="Calibri"/>
-          <w:b w:val="0"/>
-          <w:i/>
-          <w:color w:val="505050"/>
-          <w:sz w:val="20"/>
-          <w:rFonts w:eastAsia="Microsoft YaHei" w:ascii="Calibri"/>
-        </w:rPr>
-        <w:t>dǎkǎ</w:t>
-      </w:r>
-    </w:p>
-    <w:p>
-      <w:pPr>
-        <w:spacing w:before="0" w:after="60"/>
-      </w:pPr>
-      <w:r>
-        <w:rPr>
-          <w:rFonts w:ascii="맑은 고딕" w:hAnsi="맑은 고딕"/>
-          <w:b/>
-          <w:i w:val="0"/>
-          <w:color w:val="282828"/>
-          <w:sz w:val="20"/>
-          <w:rFonts w:eastAsia="Microsoft YaHei" w:ascii="맑은 고딕"/>
-        </w:rPr>
-        <w:t xml:space="preserve">💡 의미  </w:t>
-      </w:r>
-      <w:r>
-        <w:rPr>
-          <w:rFonts w:ascii="맑은 고딕" w:hAnsi="맑은 고딕"/>
-          <w:b w:val="0"/>
-          <w:i w:val="0"/>
-          <w:sz w:val="21"/>
-          <w:rFonts w:eastAsia="Microsoft YaHei" w:ascii="맑은 고딕"/>
-        </w:rPr>
-        <w:t>출근/퇴근 기록을 남기다; (장소에) 방문 인증하다</w:t>
-      </w:r>
-    </w:p>
-    <w:p>
-      <w:pPr>
-        <w:spacing w:before="0" w:after="40"/>
-      </w:pPr>
-      <w:r>
-        <w:rPr>
-          <w:rFonts w:ascii="맑은 고딕" w:hAnsi="맑은 고딕"/>
-          <w:b/>
-          <w:i w:val="0"/>
-          <w:color w:val="646464"/>
-          <w:sz w:val="19"/>
-          <w:rFonts w:eastAsia="Microsoft YaHei" w:ascii="맑은 고딕"/>
-        </w:rPr>
-        <w:t xml:space="preserve">📌 원문  </w:t>
-      </w:r>
-      <w:r>
-        <w:rPr>
-          <w:rFonts w:ascii="Microsoft YaHei" w:hAnsi="Microsoft YaHei"/>
-          <w:b w:val="0"/>
-          <w:i/>
-          <w:color w:val="5A5A5A"/>
-          <w:sz w:val="19"/>
-          <w:rFonts w:eastAsia="Microsoft YaHei" w:ascii="Microsoft YaHei"/>
-        </w:rPr>
-        <w:t>"旅客纷纷来打卡."</w:t>
-      </w:r>
-    </w:p>
-    <w:p>
-      <w:pPr>
-        <w:spacing w:before="40" w:after="40"/>
-      </w:pPr>
-      <w:r>
-        <w:rPr>
-          <w:rFonts w:ascii="맑은 고딕" w:hAnsi="맑은 고딕"/>
-          <w:b/>
-          <w:i w:val="0"/>
-          <w:color w:val="B42828"/>
-          <w:sz w:val="20"/>
-          <w:rFonts w:eastAsia="Microsoft YaHei" w:ascii="맑은 고딕"/>
-        </w:rPr>
-        <w:t xml:space="preserve">✏️ 예문  </w:t>
-      </w:r>
-      <w:r>
-        <w:rPr>
-          <w:rFonts w:ascii="Microsoft YaHei" w:hAnsi="Microsoft YaHei"/>
-          <w:b/>
-          <w:i w:val="0"/>
-          <w:color w:val="8C1E1E"/>
-          <w:sz w:val="21"/>
-          <w:rFonts w:eastAsia="Microsoft YaHei" w:ascii="Microsoft YaHei"/>
-        </w:rPr>
-        <w:t>每天早上九点前，我都要在公司系统上打卡。</w:t>
-      </w:r>
-    </w:p>
-    <w:p>
-      <w:pPr>
-        <w:spacing w:before="120" w:after="0"/>
-      </w:pPr>
-      <w:r>
-        <w:rPr>
-          <w:rFonts w:ascii="맑은 고딕" w:hAnsi="맑은 고딕"/>
-          <w:b w:val="0"/>
-          <w:i w:val="0"/>
-          <w:color w:val="C8C8C8"/>
-          <w:sz w:val="14"/>
-          <w:rFonts w:eastAsia="Microsoft YaHei" w:ascii="맑은 고딕"/>
-        </w:rPr>
-        <w:t>────────────────────────────────────────────────────────────</w:t>
-      </w:r>
-    </w:p>
-    <w:p>
-      <w:pPr>
-        <w:spacing w:before="200" w:after="40"/>
-      </w:pPr>
-      <w:r>
-        <w:rPr>
-          <w:rFonts w:ascii="맑은 고딕" w:hAnsi="맑은 고딕"/>
-          <w:b w:val="0"/>
-          <w:i w:val="0"/>
-          <w:color w:val="969696"/>
-          <w:sz w:val="20"/>
-          <w:rFonts w:eastAsia="Microsoft YaHei" w:ascii="맑은 고딕"/>
-        </w:rPr>
-        <w:t xml:space="preserve">018.  </w:t>
-      </w:r>
-      <w:r>
-        <w:rPr>
-          <w:rFonts w:ascii="Microsoft YaHei" w:hAnsi="Microsoft YaHei"/>
-          <w:b/>
-          <w:i w:val="0"/>
-          <w:color w:val="961414"/>
-          <w:sz w:val="28"/>
-          <w:rFonts w:eastAsia="Microsoft YaHei" w:ascii="Microsoft YaHei"/>
-        </w:rPr>
-        <w:t>告别</w:t>
-      </w:r>
-      <w:r>
-        <w:rPr>
-          <w:rFonts w:ascii="Calibri" w:hAnsi="Calibri"/>
-          <w:b w:val="0"/>
-          <w:i w:val="0"/>
-          <w:color w:val="787878"/>
-          <w:sz w:val="18"/>
-          <w:rFonts w:eastAsia="Microsoft YaHei" w:ascii="Calibri"/>
-        </w:rPr>
-        <w:t xml:space="preserve">   [SEPARABLE VERB]</w:t>
-      </w:r>
-    </w:p>
-    <w:p>
-      <w:pPr>
-        <w:spacing w:before="0" w:after="40"/>
-      </w:pPr>
-      <w:r>
-        <w:rPr>
-          <w:rFonts w:ascii="맑은 고딕" w:hAnsi="맑은 고딕"/>
-          <w:b w:val="0"/>
-          <w:i w:val="0"/>
-          <w:sz w:val="20"/>
-          <w:rFonts w:eastAsia="Microsoft YaHei" w:ascii="맑은 고딕"/>
-        </w:rPr>
-        <w:t xml:space="preserve">🔊 </w:t>
-      </w:r>
-      <w:r>
-        <w:rPr>
-          <w:rFonts w:ascii="Calibri" w:hAnsi="Calibri"/>
-          <w:b w:val="0"/>
-          <w:i/>
-          <w:color w:val="505050"/>
-          <w:sz w:val="20"/>
-          <w:rFonts w:eastAsia="Microsoft YaHei" w:ascii="Calibri"/>
-        </w:rPr>
-        <w:t>gàobié</w:t>
-      </w:r>
-    </w:p>
-    <w:p>
-      <w:pPr>
-        <w:spacing w:before="0" w:after="60"/>
-      </w:pPr>
-      <w:r>
-        <w:rPr>
-          <w:rFonts w:ascii="맑은 고딕" w:hAnsi="맑은 고딕"/>
-          <w:b/>
-          <w:i w:val="0"/>
-          <w:color w:val="282828"/>
-          <w:sz w:val="20"/>
-          <w:rFonts w:eastAsia="Microsoft YaHei" w:ascii="맑은 고딕"/>
-        </w:rPr>
-        <w:t xml:space="preserve">💡 의미  </w:t>
-      </w:r>
-      <w:r>
-        <w:rPr>
-          <w:rFonts w:ascii="맑은 고딕" w:hAnsi="맑은 고딕"/>
-          <w:b w:val="0"/>
-          <w:i w:val="0"/>
-          <w:sz w:val="21"/>
-          <w:rFonts w:eastAsia="Microsoft YaHei" w:ascii="맑은 고딕"/>
-        </w:rPr>
-        <w:t>작별하다; 떠나다</w:t>
-      </w:r>
-    </w:p>
-    <w:p>
-      <w:pPr>
-        <w:spacing w:before="0" w:after="40"/>
-      </w:pPr>
-      <w:r>
-        <w:rPr>
-          <w:rFonts w:ascii="맑은 고딕" w:hAnsi="맑은 고딕"/>
-          <w:b/>
-          <w:i w:val="0"/>
-          <w:color w:val="646464"/>
-          <w:sz w:val="19"/>
-          <w:rFonts w:eastAsia="Microsoft YaHei" w:ascii="맑은 고딕"/>
-        </w:rPr>
-        <w:t xml:space="preserve">📌 원문  </w:t>
-      </w:r>
-      <w:r>
-        <w:rPr>
-          <w:rFonts w:ascii="Microsoft YaHei" w:hAnsi="Microsoft YaHei"/>
-          <w:b w:val="0"/>
-          <w:i/>
-          <w:color w:val="5A5A5A"/>
-          <w:sz w:val="19"/>
-          <w:rFonts w:eastAsia="Microsoft YaHei" w:ascii="Microsoft YaHei"/>
-        </w:rPr>
-        <w:t>"老列车在逐渐“告别”"</w:t>
-      </w:r>
-    </w:p>
-    <w:p>
-      <w:pPr>
-        <w:spacing w:before="40" w:after="40"/>
-      </w:pPr>
-      <w:r>
-        <w:rPr>
-          <w:rFonts w:ascii="맑은 고딕" w:hAnsi="맑은 고딕"/>
-          <w:b/>
-          <w:i w:val="0"/>
-          <w:color w:val="B42828"/>
-          <w:sz w:val="20"/>
-          <w:rFonts w:eastAsia="Microsoft YaHei" w:ascii="맑은 고딕"/>
-        </w:rPr>
-        <w:t xml:space="preserve">✏️ 예문  </w:t>
-      </w:r>
-      <w:r>
-        <w:rPr>
-          <w:rFonts w:ascii="Microsoft YaHei" w:hAnsi="Microsoft YaHei"/>
-          <w:b/>
-          <w:i w:val="0"/>
-          <w:color w:val="8C1E1E"/>
-          <w:sz w:val="21"/>
-          <w:rFonts w:eastAsia="Microsoft YaHei" w:ascii="Microsoft YaHei"/>
-        </w:rPr>
-        <w:t>他决定告别大城市的生活，回到家乡发展。</w:t>
-      </w:r>
-    </w:p>
-    <w:p>
-      <w:pPr>
-        <w:spacing w:before="120" w:after="0"/>
-      </w:pPr>
-      <w:r>
-        <w:rPr>
-          <w:rFonts w:ascii="맑은 고딕" w:hAnsi="맑은 고딕"/>
-          <w:b w:val="0"/>
-          <w:i w:val="0"/>
-          <w:color w:val="C8C8C8"/>
-          <w:sz w:val="14"/>
-          <w:rFonts w:eastAsia="Microsoft YaHei" w:ascii="맑은 고딕"/>
-        </w:rPr>
-        <w:t>────────────────────────────────────────────────────────────</w:t>
-      </w:r>
-    </w:p>
-    <w:p>
-      <w:pPr>
-        <w:spacing w:before="200" w:after="40"/>
-      </w:pPr>
-      <w:r>
-        <w:rPr>
-          <w:rFonts w:ascii="맑은 고딕" w:hAnsi="맑은 고딕"/>
-          <w:b w:val="0"/>
-          <w:i w:val="0"/>
-          <w:color w:val="969696"/>
-          <w:sz w:val="20"/>
-          <w:rFonts w:eastAsia="Microsoft YaHei" w:ascii="맑은 고딕"/>
-        </w:rPr>
-        <w:t xml:space="preserve">019.  </w:t>
-      </w:r>
-      <w:r>
-        <w:rPr>
-          <w:rFonts w:ascii="Microsoft YaHei" w:hAnsi="Microsoft YaHei"/>
-          <w:b/>
-          <w:i w:val="0"/>
-          <w:color w:val="961414"/>
-          <w:sz w:val="28"/>
-          <w:rFonts w:eastAsia="Microsoft YaHei" w:ascii="Microsoft YaHei"/>
-        </w:rPr>
-        <w:t>解锁</w:t>
-      </w:r>
-      <w:r>
-        <w:rPr>
-          <w:rFonts w:ascii="Calibri" w:hAnsi="Calibri"/>
-          <w:b w:val="0"/>
-          <w:i w:val="0"/>
-          <w:color w:val="787878"/>
-          <w:sz w:val="18"/>
-          <w:rFonts w:eastAsia="Microsoft YaHei" w:ascii="Calibri"/>
-        </w:rPr>
-        <w:t xml:space="preserve">   [VERB]</w:t>
-      </w:r>
-    </w:p>
-    <w:p>
-      <w:pPr>
-        <w:spacing w:before="0" w:after="40"/>
-      </w:pPr>
-      <w:r>
-        <w:rPr>
-          <w:rFonts w:ascii="맑은 고딕" w:hAnsi="맑은 고딕"/>
-          <w:b w:val="0"/>
-          <w:i w:val="0"/>
-          <w:sz w:val="20"/>
-          <w:rFonts w:eastAsia="Microsoft YaHei" w:ascii="맑은 고딕"/>
-        </w:rPr>
-        <w:t xml:space="preserve">🔊 </w:t>
-      </w:r>
-      <w:r>
-        <w:rPr>
-          <w:rFonts w:ascii="Calibri" w:hAnsi="Calibri"/>
-          <w:b w:val="0"/>
-          <w:i/>
-          <w:color w:val="505050"/>
-          <w:sz w:val="20"/>
-          <w:rFonts w:eastAsia="Microsoft YaHei" w:ascii="Calibri"/>
-        </w:rPr>
-        <w:t>jiěsuǒ</w:t>
-      </w:r>
-    </w:p>
-    <w:p>
-      <w:pPr>
-        <w:spacing w:before="0" w:after="60"/>
-      </w:pPr>
-      <w:r>
-        <w:rPr>
-          <w:rFonts w:ascii="맑은 고딕" w:hAnsi="맑은 고딕"/>
-          <w:b/>
-          <w:i w:val="0"/>
-          <w:color w:val="282828"/>
-          <w:sz w:val="20"/>
-          <w:rFonts w:eastAsia="Microsoft YaHei" w:ascii="맑은 고딕"/>
-        </w:rPr>
-        <w:t xml:space="preserve">💡 의미  </w:t>
-      </w:r>
-      <w:r>
-        <w:rPr>
-          <w:rFonts w:ascii="맑은 고딕" w:hAnsi="맑은 고딕"/>
-          <w:b w:val="0"/>
-          <w:i w:val="0"/>
-          <w:sz w:val="21"/>
-          <w:rFonts w:eastAsia="Microsoft YaHei" w:ascii="맑은 고딕"/>
-        </w:rPr>
-        <w:t>잠금을 해제하다; (새로운 가능성 등을) 발견하다/드러내다</w:t>
-      </w:r>
-    </w:p>
-    <w:p>
-      <w:pPr>
-        <w:spacing w:before="0" w:after="40"/>
-      </w:pPr>
-      <w:r>
-        <w:rPr>
-          <w:rFonts w:ascii="맑은 고딕" w:hAnsi="맑은 고딕"/>
-          <w:b/>
-          <w:i w:val="0"/>
-          <w:color w:val="646464"/>
-          <w:sz w:val="19"/>
-          <w:rFonts w:eastAsia="Microsoft YaHei" w:ascii="맑은 고딕"/>
-        </w:rPr>
-        <w:t xml:space="preserve">📌 원문  </w:t>
-      </w:r>
-      <w:r>
-        <w:rPr>
-          <w:rFonts w:ascii="Microsoft YaHei" w:hAnsi="Microsoft YaHei"/>
-          <w:b w:val="0"/>
-          <w:i/>
-          <w:color w:val="5A5A5A"/>
-          <w:sz w:val="19"/>
-          <w:rFonts w:eastAsia="Microsoft YaHei" w:ascii="Microsoft YaHei"/>
-        </w:rPr>
-        <w:t>"解锁亲子环保新场景"</w:t>
-      </w:r>
-    </w:p>
-    <w:p>
-      <w:pPr>
-        <w:spacing w:before="40" w:after="40"/>
-      </w:pPr>
-      <w:r>
-        <w:rPr>
-          <w:rFonts w:ascii="맑은 고딕" w:hAnsi="맑은 고딕"/>
-          <w:b/>
-          <w:i w:val="0"/>
-          <w:color w:val="B42828"/>
-          <w:sz w:val="20"/>
-          <w:rFonts w:eastAsia="Microsoft YaHei" w:ascii="맑은 고딕"/>
-        </w:rPr>
-        <w:t xml:space="preserve">✏️ 예문  </w:t>
-      </w:r>
-      <w:r>
-        <w:rPr>
-          <w:rFonts w:ascii="Microsoft YaHei" w:hAnsi="Microsoft YaHei"/>
-          <w:b/>
-          <w:i w:val="0"/>
-          <w:color w:val="8C1E1E"/>
-          <w:sz w:val="21"/>
-          <w:rFonts w:eastAsia="Microsoft YaHei" w:ascii="Microsoft YaHei"/>
-        </w:rPr>
-        <w:t>这款新软件可以帮助我们解锁更多工作效率的潜力。</w:t>
-      </w:r>
-    </w:p>
-    <w:p>
-      <w:pPr>
-        <w:spacing w:before="120" w:after="0"/>
-      </w:pPr>
-      <w:r>
-        <w:rPr>
-          <w:rFonts w:ascii="맑은 고딕" w:hAnsi="맑은 고딕"/>
-          <w:b w:val="0"/>
-          <w:i w:val="0"/>
-          <w:color w:val="C8C8C8"/>
-          <w:sz w:val="14"/>
-          <w:rFonts w:eastAsia="Microsoft YaHei" w:ascii="맑은 고딕"/>
-        </w:rPr>
-        <w:t>────────────────────────────────────────────────────────────</w:t>
-      </w:r>
-    </w:p>
-    <w:p>
-      <w:pPr>
-        <w:spacing w:before="200" w:after="40"/>
-      </w:pPr>
-      <w:r>
-        <w:rPr>
-          <w:rFonts w:ascii="맑은 고딕" w:hAnsi="맑은 고딕"/>
-          <w:b w:val="0"/>
-          <w:i w:val="0"/>
-          <w:color w:val="969696"/>
-          <w:sz w:val="20"/>
-          <w:rFonts w:eastAsia="Microsoft YaHei" w:ascii="맑은 고딕"/>
-        </w:rPr>
-        <w:t xml:space="preserve">020.  </w:t>
-      </w:r>
-      <w:r>
-        <w:rPr>
-          <w:rFonts w:ascii="Microsoft YaHei" w:hAnsi="Microsoft YaHei"/>
-          <w:b/>
-          <w:i w:val="0"/>
-          <w:color w:val="961414"/>
-          <w:sz w:val="28"/>
-          <w:rFonts w:eastAsia="Microsoft YaHei" w:ascii="Microsoft YaHei"/>
-        </w:rPr>
-        <w:t>融入</w:t>
-      </w:r>
-      <w:r>
-        <w:rPr>
-          <w:rFonts w:ascii="Calibri" w:hAnsi="Calibri"/>
-          <w:b w:val="0"/>
-          <w:i w:val="0"/>
-          <w:color w:val="787878"/>
-          <w:sz w:val="18"/>
-          <w:rFonts w:eastAsia="Microsoft YaHei" w:ascii="Calibri"/>
-        </w:rPr>
-        <w:t xml:space="preserve">   [VERB]</w:t>
-      </w:r>
-    </w:p>
-    <w:p>
-      <w:pPr>
-        <w:spacing w:before="0" w:after="40"/>
-      </w:pPr>
-      <w:r>
-        <w:rPr>
-          <w:rFonts w:ascii="맑은 고딕" w:hAnsi="맑은 고딕"/>
-          <w:b w:val="0"/>
-          <w:i w:val="0"/>
-          <w:sz w:val="20"/>
-          <w:rFonts w:eastAsia="Microsoft YaHei" w:ascii="맑은 고딕"/>
-        </w:rPr>
-        <w:t xml:space="preserve">🔊 </w:t>
-      </w:r>
-      <w:r>
-        <w:rPr>
-          <w:rFonts w:ascii="Calibri" w:hAnsi="Calibri"/>
-          <w:b w:val="0"/>
-          <w:i/>
-          <w:color w:val="505050"/>
-          <w:sz w:val="20"/>
-          <w:rFonts w:eastAsia="Microsoft YaHei" w:ascii="Calibri"/>
-        </w:rPr>
-        <w:t>róngrù</w:t>
-      </w:r>
-    </w:p>
-    <w:p>
-      <w:pPr>
-        <w:spacing w:before="0" w:after="60"/>
-      </w:pPr>
-      <w:r>
-        <w:rPr>
-          <w:rFonts w:ascii="맑은 고딕" w:hAnsi="맑은 고딕"/>
-          <w:b/>
-          <w:i w:val="0"/>
-          <w:color w:val="282828"/>
-          <w:sz w:val="20"/>
-          <w:rFonts w:eastAsia="Microsoft YaHei" w:ascii="맑은 고딕"/>
-        </w:rPr>
-        <w:t xml:space="preserve">💡 의미  </w:t>
-      </w:r>
-      <w:r>
-        <w:rPr>
-          <w:rFonts w:ascii="맑은 고딕" w:hAnsi="맑은 고딕"/>
-          <w:b w:val="0"/>
-          <w:i w:val="0"/>
-          <w:sz w:val="21"/>
-          <w:rFonts w:eastAsia="Microsoft YaHei" w:ascii="맑은 고딕"/>
-        </w:rPr>
-        <w:t>~에 녹아들다, ~에 융합되다, ~에 스며들다</w:t>
-      </w:r>
-    </w:p>
-    <w:p>
-      <w:pPr>
-        <w:spacing w:before="0" w:after="40"/>
-      </w:pPr>
-      <w:r>
-        <w:rPr>
-          <w:rFonts w:ascii="맑은 고딕" w:hAnsi="맑은 고딕"/>
-          <w:b/>
-          <w:i w:val="0"/>
-          <w:color w:val="646464"/>
-          <w:sz w:val="19"/>
-          <w:rFonts w:eastAsia="Microsoft YaHei" w:ascii="맑은 고딕"/>
-        </w:rPr>
-        <w:t xml:space="preserve">📌 원문  </w:t>
-      </w:r>
-      <w:r>
-        <w:rPr>
-          <w:rFonts w:ascii="Microsoft YaHei" w:hAnsi="Microsoft YaHei"/>
-          <w:b w:val="0"/>
-          <w:i/>
-          <w:color w:val="5A5A5A"/>
-          <w:sz w:val="19"/>
-          <w:rFonts w:eastAsia="Microsoft YaHei" w:ascii="Microsoft YaHei"/>
-        </w:rPr>
-        <w:t>"通讯｜融入街区的“环保时尚场”"</w:t>
-      </w:r>
-    </w:p>
-    <w:p>
-      <w:pPr>
-        <w:spacing w:before="40" w:after="40"/>
-      </w:pPr>
-      <w:r>
-        <w:rPr>
-          <w:rFonts w:ascii="맑은 고딕" w:hAnsi="맑은 고딕"/>
-          <w:b/>
-          <w:i w:val="0"/>
-          <w:color w:val="B42828"/>
-          <w:sz w:val="20"/>
-          <w:rFonts w:eastAsia="Microsoft YaHei" w:ascii="맑은 고딕"/>
-        </w:rPr>
-        <w:t xml:space="preserve">✏️ 예문  </w:t>
-      </w:r>
-      <w:r>
-        <w:rPr>
-          <w:rFonts w:ascii="Microsoft YaHei" w:hAnsi="Microsoft YaHei"/>
-          <w:b/>
-          <w:i w:val="0"/>
-          <w:color w:val="8C1E1E"/>
-          <w:sz w:val="21"/>
-          <w:rFonts w:eastAsia="Microsoft YaHei" w:ascii="Microsoft YaHei"/>
-        </w:rPr>
-        <w:t>我们公司正在努力让新员工尽快融入团队。</w:t>
-      </w:r>
-    </w:p>
-    <w:p>
-      <w:pPr>
-        <w:spacing w:before="120" w:after="0"/>
-      </w:pPr>
-      <w:r>
-        <w:rPr>
-          <w:rFonts w:ascii="맑은 고딕" w:hAnsi="맑은 고딕"/>
-          <w:b w:val="0"/>
-          <w:i w:val="0"/>
-          <w:color w:val="C8C8C8"/>
-          <w:sz w:val="14"/>
-          <w:rFonts w:eastAsia="Microsoft YaHei" w:ascii="맑은 고딕"/>
-        </w:rPr>
-        <w:t>────────────────────────────────────────────────────────────</w:t>
-      </w:r>
-    </w:p>
-    <w:p>
-      <w:pPr>
-        <w:spacing w:before="200" w:after="40"/>
-      </w:pPr>
-      <w:r>
-        <w:rPr>
-          <w:rFonts w:ascii="맑은 고딕" w:hAnsi="맑은 고딕"/>
-          <w:b w:val="0"/>
-          <w:i w:val="0"/>
-          <w:color w:val="969696"/>
-          <w:sz w:val="20"/>
-          <w:rFonts w:eastAsia="Microsoft YaHei" w:ascii="맑은 고딕"/>
-        </w:rPr>
-        <w:t xml:space="preserve">021.  </w:t>
-      </w:r>
-      <w:r>
-        <w:rPr>
-          <w:rFonts w:ascii="Microsoft YaHei" w:hAnsi="Microsoft YaHei"/>
-          <w:b/>
-          <w:i w:val="0"/>
-          <w:color w:val="961414"/>
-          <w:sz w:val="28"/>
-          <w:rFonts w:eastAsia="Microsoft YaHei" w:ascii="Microsoft YaHei"/>
-        </w:rPr>
-        <w:t>转发</w:t>
-      </w:r>
-      <w:r>
-        <w:rPr>
-          <w:rFonts w:ascii="Calibri" w:hAnsi="Calibri"/>
-          <w:b w:val="0"/>
-          <w:i w:val="0"/>
-          <w:color w:val="787878"/>
-          <w:sz w:val="18"/>
-          <w:rFonts w:eastAsia="Microsoft YaHei" w:ascii="Calibri"/>
-        </w:rPr>
-        <w:t xml:space="preserve">   [SEPARABLE VERB]</w:t>
-      </w:r>
-    </w:p>
-    <w:p>
-      <w:pPr>
-        <w:spacing w:before="0" w:after="40"/>
-      </w:pPr>
-      <w:r>
-        <w:rPr>
-          <w:rFonts w:ascii="맑은 고딕" w:hAnsi="맑은 고딕"/>
-          <w:b w:val="0"/>
-          <w:i w:val="0"/>
-          <w:sz w:val="20"/>
-          <w:rFonts w:eastAsia="Microsoft YaHei" w:ascii="맑은 고딕"/>
-        </w:rPr>
-        <w:t xml:space="preserve">🔊 </w:t>
-      </w:r>
-      <w:r>
-        <w:rPr>
-          <w:rFonts w:ascii="Calibri" w:hAnsi="Calibri"/>
-          <w:b w:val="0"/>
-          <w:i/>
-          <w:color w:val="505050"/>
-          <w:sz w:val="20"/>
-          <w:rFonts w:eastAsia="Microsoft YaHei" w:ascii="Calibri"/>
-        </w:rPr>
-        <w:t>zhuǎnfā</w:t>
-      </w:r>
-    </w:p>
-    <w:p>
-      <w:pPr>
-        <w:spacing w:before="0" w:after="60"/>
-      </w:pPr>
-      <w:r>
-        <w:rPr>
-          <w:rFonts w:ascii="맑은 고딕" w:hAnsi="맑은 고딕"/>
-          <w:b/>
-          <w:i w:val="0"/>
-          <w:color w:val="282828"/>
-          <w:sz w:val="20"/>
-          <w:rFonts w:eastAsia="Microsoft YaHei" w:ascii="맑은 고딕"/>
-        </w:rPr>
-        <w:t xml:space="preserve">💡 의미  </w:t>
-      </w:r>
-      <w:r>
-        <w:rPr>
-          <w:rFonts w:ascii="맑은 고딕" w:hAnsi="맑은 고딕"/>
-          <w:b w:val="0"/>
-          <w:i w:val="0"/>
-          <w:sz w:val="21"/>
-          <w:rFonts w:eastAsia="Microsoft YaHei" w:ascii="맑은 고딕"/>
-        </w:rPr>
-        <w:t>(메시지, 게시물 등을) 전달하다, 공유하다, 포워딩하다</w:t>
-      </w:r>
-    </w:p>
-    <w:p>
-      <w:pPr>
-        <w:spacing w:before="0" w:after="40"/>
-      </w:pPr>
-      <w:r>
-        <w:rPr>
-          <w:rFonts w:ascii="맑은 고딕" w:hAnsi="맑은 고딕"/>
-          <w:b/>
-          <w:i w:val="0"/>
-          <w:color w:val="646464"/>
-          <w:sz w:val="19"/>
-          <w:rFonts w:eastAsia="Microsoft YaHei" w:ascii="맑은 고딕"/>
-        </w:rPr>
-        <w:t xml:space="preserve">📌 원문  </w:t>
-      </w:r>
-      <w:r>
-        <w:rPr>
-          <w:rFonts w:ascii="Microsoft YaHei" w:hAnsi="Microsoft YaHei"/>
-          <w:b w:val="0"/>
-          <w:i/>
-          <w:color w:val="5A5A5A"/>
-          <w:sz w:val="19"/>
-          <w:rFonts w:eastAsia="Microsoft YaHei" w:ascii="Microsoft YaHei"/>
-        </w:rPr>
-        <w:t>"获外交部发言人转发"</w:t>
-      </w:r>
-    </w:p>
-    <w:p>
-      <w:pPr>
-        <w:spacing w:before="40" w:after="40"/>
-      </w:pPr>
-      <w:r>
-        <w:rPr>
-          <w:rFonts w:ascii="맑은 고딕" w:hAnsi="맑은 고딕"/>
-          <w:b/>
-          <w:i w:val="0"/>
-          <w:color w:val="B42828"/>
-          <w:sz w:val="20"/>
-          <w:rFonts w:eastAsia="Microsoft YaHei" w:ascii="맑은 고딕"/>
-        </w:rPr>
-        <w:t xml:space="preserve">✏️ 예문  </w:t>
-      </w:r>
-      <w:r>
-        <w:rPr>
-          <w:rFonts w:ascii="Microsoft YaHei" w:hAnsi="Microsoft YaHei"/>
-          <w:b/>
-          <w:i w:val="0"/>
-          <w:color w:val="8C1E1E"/>
-          <w:sz w:val="21"/>
-          <w:rFonts w:eastAsia="Microsoft YaHei" w:ascii="Microsoft YaHei"/>
-        </w:rPr>
-        <w:t>请大家把这个通知转发到各个部门群里。</w:t>
-      </w:r>
-    </w:p>
-    <w:p>
-      <w:pPr>
-        <w:spacing w:before="120" w:after="0"/>
-      </w:pPr>
-      <w:r>
-        <w:rPr>
-          <w:rFonts w:ascii="맑은 고딕" w:hAnsi="맑은 고딕"/>
-          <w:b w:val="0"/>
-          <w:i w:val="0"/>
-          <w:color w:val="C8C8C8"/>
-          <w:sz w:val="14"/>
-          <w:rFonts w:eastAsia="Microsoft YaHei" w:ascii="맑은 고딕"/>
-        </w:rPr>
-        <w:t>────────────────────────────────────────────────────────────</w:t>
-      </w:r>
-    </w:p>
-    <w:p>
-      <w:pPr>
-        <w:spacing w:before="200" w:after="40"/>
-      </w:pPr>
-      <w:r>
-        <w:rPr>
-          <w:rFonts w:ascii="맑은 고딕" w:hAnsi="맑은 고딕"/>
-          <w:b w:val="0"/>
-          <w:i w:val="0"/>
-          <w:color w:val="969696"/>
-          <w:sz w:val="20"/>
-          <w:rFonts w:eastAsia="Microsoft YaHei" w:ascii="맑은 고딕"/>
-        </w:rPr>
-        <w:t xml:space="preserve">022.  </w:t>
-      </w:r>
-      <w:r>
-        <w:rPr>
-          <w:rFonts w:ascii="Microsoft YaHei" w:hAnsi="Microsoft YaHei"/>
-          <w:b/>
-          <w:i w:val="0"/>
-          <w:color w:val="961414"/>
-          <w:sz w:val="28"/>
-          <w:rFonts w:eastAsia="Microsoft YaHei" w:ascii="Microsoft YaHei"/>
-        </w:rPr>
-        <w:t>吐槽</w:t>
-      </w:r>
-      <w:r>
-        <w:rPr>
-          <w:rFonts w:ascii="Calibri" w:hAnsi="Calibri"/>
-          <w:b w:val="0"/>
-          <w:i w:val="0"/>
-          <w:color w:val="787878"/>
-          <w:sz w:val="18"/>
-          <w:rFonts w:eastAsia="Microsoft YaHei" w:ascii="Calibri"/>
-        </w:rPr>
-        <w:t xml:space="preserve">   [COLLOQUIALISM]</w:t>
-      </w:r>
-    </w:p>
-    <w:p>
-      <w:pPr>
-        <w:spacing w:before="0" w:after="40"/>
-      </w:pPr>
-      <w:r>
-        <w:rPr>
-          <w:rFonts w:ascii="맑은 고딕" w:hAnsi="맑은 고딕"/>
-          <w:b w:val="0"/>
-          <w:i w:val="0"/>
-          <w:sz w:val="20"/>
-          <w:rFonts w:eastAsia="Microsoft YaHei" w:ascii="맑은 고딕"/>
-        </w:rPr>
-        <w:t xml:space="preserve">🔊 </w:t>
-      </w:r>
-      <w:r>
-        <w:rPr>
-          <w:rFonts w:ascii="Calibri" w:hAnsi="Calibri"/>
-          <w:b w:val="0"/>
-          <w:i/>
-          <w:color w:val="505050"/>
-          <w:sz w:val="20"/>
-          <w:rFonts w:eastAsia="Microsoft YaHei" w:ascii="Calibri"/>
-        </w:rPr>
-        <w:t>tǔcáo</w:t>
-      </w:r>
-    </w:p>
-    <w:p>
-      <w:pPr>
-        <w:spacing w:before="0" w:after="60"/>
-      </w:pPr>
-      <w:r>
-        <w:rPr>
-          <w:rFonts w:ascii="맑은 고딕" w:hAnsi="맑은 고딕"/>
-          <w:b/>
-          <w:i w:val="0"/>
-          <w:color w:val="282828"/>
-          <w:sz w:val="20"/>
-          <w:rFonts w:eastAsia="Microsoft YaHei" w:ascii="맑은 고딕"/>
-        </w:rPr>
-        <w:t xml:space="preserve">💡 의미  </w:t>
-      </w:r>
-      <w:r>
-        <w:rPr>
-          <w:rFonts w:ascii="맑은 고딕" w:hAnsi="맑은 고딕"/>
-          <w:b w:val="0"/>
-          <w:i w:val="0"/>
-          <w:sz w:val="21"/>
-          <w:rFonts w:eastAsia="Microsoft YaHei" w:ascii="맑은 고딕"/>
-        </w:rPr>
-        <w:t>불평하다, 투덜거리다, 하소연하다 (속어)</w:t>
-      </w:r>
-    </w:p>
-    <w:p>
-      <w:pPr>
-        <w:spacing w:before="0" w:after="40"/>
-      </w:pPr>
-      <w:r>
-        <w:rPr>
-          <w:rFonts w:ascii="맑은 고딕" w:hAnsi="맑은 고딕"/>
-          <w:b/>
-          <w:i w:val="0"/>
-          <w:color w:val="646464"/>
-          <w:sz w:val="19"/>
-          <w:rFonts w:eastAsia="Microsoft YaHei" w:ascii="맑은 고딕"/>
-        </w:rPr>
-        <w:t xml:space="preserve">📌 원문  </w:t>
-      </w:r>
-      <w:r>
-        <w:rPr>
-          <w:rFonts w:ascii="Microsoft YaHei" w:hAnsi="Microsoft YaHei"/>
-          <w:b w:val="0"/>
-          <w:i/>
-          <w:color w:val="5A5A5A"/>
-          <w:sz w:val="19"/>
-          <w:rFonts w:eastAsia="Microsoft YaHei" w:ascii="Microsoft YaHei"/>
-        </w:rPr>
-        <w:t>"网友吐槽"</w:t>
-      </w:r>
-    </w:p>
-    <w:p>
-      <w:pPr>
-        <w:spacing w:before="40" w:after="40"/>
-      </w:pPr>
-      <w:r>
-        <w:rPr>
-          <w:rFonts w:ascii="맑은 고딕" w:hAnsi="맑은 고딕"/>
-          <w:b/>
-          <w:i w:val="0"/>
-          <w:color w:val="B42828"/>
-          <w:sz w:val="20"/>
-          <w:rFonts w:eastAsia="Microsoft YaHei" w:ascii="맑은 고딕"/>
-        </w:rPr>
-        <w:t xml:space="preserve">✏️ 예문  </w:t>
-      </w:r>
-      <w:r>
-        <w:rPr>
-          <w:rFonts w:ascii="Microsoft YaHei" w:hAnsi="Microsoft YaHei"/>
-          <w:b/>
-          <w:i w:val="0"/>
-          <w:color w:val="8C1E1E"/>
-          <w:sz w:val="21"/>
-          <w:rFonts w:eastAsia="Microsoft YaHei" w:ascii="Microsoft YaHei"/>
-        </w:rPr>
-        <w:t>昨天会议太长了，好多同事都在私下吐槽。</w:t>
-      </w:r>
-    </w:p>
-    <w:p>
-      <w:pPr>
-        <w:spacing w:before="120" w:after="0"/>
-      </w:pPr>
-      <w:r>
-        <w:rPr>
-          <w:rFonts w:ascii="맑은 고딕" w:hAnsi="맑은 고딕"/>
-          <w:b w:val="0"/>
-          <w:i w:val="0"/>
-          <w:color w:val="C8C8C8"/>
-          <w:sz w:val="14"/>
-          <w:rFonts w:eastAsia="Microsoft YaHei" w:ascii="맑은 고딕"/>
-        </w:rPr>
-        <w:t>────────────────────────────────────────────────────────────</w:t>
-      </w:r>
-    </w:p>
-    <w:p>
-      <w:pPr>
-        <w:spacing w:before="200" w:after="40"/>
-      </w:pPr>
-      <w:r>
-        <w:rPr>
-          <w:rFonts w:ascii="맑은 고딕" w:hAnsi="맑은 고딕"/>
-          <w:b w:val="0"/>
-          <w:i w:val="0"/>
-          <w:color w:val="969696"/>
-          <w:sz w:val="20"/>
-          <w:rFonts w:eastAsia="Microsoft YaHei" w:ascii="맑은 고딕"/>
-        </w:rPr>
-        <w:t xml:space="preserve">023.  </w:t>
-      </w:r>
-      <w:r>
-        <w:rPr>
-          <w:rFonts w:ascii="Microsoft YaHei" w:hAnsi="Microsoft YaHei"/>
-          <w:b/>
-          <w:i w:val="0"/>
-          <w:color w:val="961414"/>
-          <w:sz w:val="28"/>
-          <w:rFonts w:eastAsia="Microsoft YaHei" w:ascii="Microsoft YaHei"/>
-        </w:rPr>
-        <w:t>没有印象</w:t>
-      </w:r>
-      <w:r>
-        <w:rPr>
-          <w:rFonts w:ascii="Calibri" w:hAnsi="Calibri"/>
-          <w:b w:val="0"/>
-          <w:i w:val="0"/>
-          <w:color w:val="787878"/>
-          <w:sz w:val="18"/>
-          <w:rFonts w:eastAsia="Microsoft YaHei" w:ascii="Calibri"/>
-        </w:rPr>
-        <w:t xml:space="preserve">   [VERB PHRASE]</w:t>
-      </w:r>
-    </w:p>
-    <w:p>
-      <w:pPr>
-        <w:spacing w:before="0" w:after="40"/>
-      </w:pPr>
-      <w:r>
-        <w:rPr>
-          <w:rFonts w:ascii="맑은 고딕" w:hAnsi="맑은 고딕"/>
-          <w:b w:val="0"/>
-          <w:i w:val="0"/>
-          <w:sz w:val="20"/>
-          <w:rFonts w:eastAsia="Microsoft YaHei" w:ascii="맑은 고딕"/>
-        </w:rPr>
-        <w:t xml:space="preserve">🔊 </w:t>
-      </w:r>
-      <w:r>
-        <w:rPr>
-          <w:rFonts w:ascii="Calibri" w:hAnsi="Calibri"/>
-          <w:b w:val="0"/>
-          <w:i/>
-          <w:color w:val="505050"/>
-          <w:sz w:val="20"/>
-          <w:rFonts w:eastAsia="Microsoft YaHei" w:ascii="Calibri"/>
-        </w:rPr>
-        <w:t>méiyǒu yìngxiàng</w:t>
-      </w:r>
-    </w:p>
-    <w:p>
-      <w:pPr>
-        <w:spacing w:before="0" w:after="60"/>
-      </w:pPr>
-      <w:r>
-        <w:rPr>
-          <w:rFonts w:ascii="맑은 고딕" w:hAnsi="맑은 고딕"/>
-          <w:b/>
-          <w:i w:val="0"/>
-          <w:color w:val="282828"/>
-          <w:sz w:val="20"/>
-          <w:rFonts w:eastAsia="Microsoft YaHei" w:ascii="맑은 고딕"/>
-        </w:rPr>
-        <w:t xml:space="preserve">💡 의미  </w:t>
-      </w:r>
-      <w:r>
-        <w:rPr>
-          <w:rFonts w:ascii="맑은 고딕" w:hAnsi="맑은 고딕"/>
-          <w:b w:val="0"/>
-          <w:i w:val="0"/>
-          <w:sz w:val="21"/>
-          <w:rFonts w:eastAsia="Microsoft YaHei" w:ascii="맑은 고딕"/>
-        </w:rPr>
-        <w:t>인상이 없다, 기억나지 않다</w:t>
-      </w:r>
-    </w:p>
-    <w:p>
-      <w:pPr>
-        <w:spacing w:before="0" w:after="40"/>
-      </w:pPr>
-      <w:r>
-        <w:rPr>
-          <w:rFonts w:ascii="맑은 고딕" w:hAnsi="맑은 고딕"/>
-          <w:b/>
-          <w:i w:val="0"/>
-          <w:color w:val="646464"/>
-          <w:sz w:val="19"/>
-          <w:rFonts w:eastAsia="Microsoft YaHei" w:ascii="맑은 고딕"/>
-        </w:rPr>
-        <w:t xml:space="preserve">📌 원문  </w:t>
-      </w:r>
-      <w:r>
-        <w:rPr>
-          <w:rFonts w:ascii="Microsoft YaHei" w:hAnsi="Microsoft YaHei"/>
-          <w:b w:val="0"/>
-          <w:i/>
-          <w:color w:val="5A5A5A"/>
-          <w:sz w:val="19"/>
-          <w:rFonts w:eastAsia="Microsoft YaHei" w:ascii="Microsoft YaHei"/>
-        </w:rPr>
-        <w:t>"却始终没有印象"</w:t>
-      </w:r>
-    </w:p>
-    <w:p>
-      <w:pPr>
-        <w:spacing w:before="40" w:after="40"/>
-      </w:pPr>
-      <w:r>
-        <w:rPr>
-          <w:rFonts w:ascii="맑은 고딕" w:hAnsi="맑은 고딕"/>
-          <w:b/>
-          <w:i w:val="0"/>
-          <w:color w:val="B42828"/>
-          <w:sz w:val="20"/>
-          <w:rFonts w:eastAsia="Microsoft YaHei" w:ascii="맑은 고딕"/>
-        </w:rPr>
-        <w:t xml:space="preserve">✏️ 예문  </w:t>
-      </w:r>
-      <w:r>
-        <w:rPr>
-          <w:rFonts w:ascii="Microsoft YaHei" w:hAnsi="Microsoft YaHei"/>
-          <w:b/>
-          <w:i w:val="0"/>
-          <w:color w:val="8C1E1E"/>
-          <w:sz w:val="21"/>
-          <w:rFonts w:eastAsia="Microsoft YaHei" w:ascii="Microsoft YaHei"/>
-        </w:rPr>
-        <w:t>我对那个新来的实习生没什么印象，他好像不太爱说话。</w:t>
-      </w:r>
-    </w:p>
-    <w:p>
-      <w:pPr>
-        <w:spacing w:before="120" w:after="0"/>
-      </w:pPr>
-      <w:r>
-        <w:rPr>
-          <w:rFonts w:ascii="맑은 고딕" w:hAnsi="맑은 고딕"/>
-          <w:b w:val="0"/>
-          <w:i w:val="0"/>
-          <w:color w:val="C8C8C8"/>
-          <w:sz w:val="14"/>
-          <w:rFonts w:eastAsia="Microsoft YaHei" w:ascii="맑은 고딕"/>
-        </w:rPr>
-        <w:t>────────────────────────────────────────────────────────────</w:t>
-      </w:r>
-    </w:p>
-    <w:p>
-      <w:pPr>
-        <w:spacing w:before="200" w:after="40"/>
-      </w:pPr>
-      <w:r>
-        <w:rPr>
-          <w:rFonts w:ascii="맑은 고딕" w:hAnsi="맑은 고딕"/>
-          <w:b w:val="0"/>
-          <w:i w:val="0"/>
-          <w:color w:val="969696"/>
-          <w:sz w:val="20"/>
-          <w:rFonts w:eastAsia="Microsoft YaHei" w:ascii="맑은 고딕"/>
-        </w:rPr>
-        <w:t xml:space="preserve">024.  </w:t>
-      </w:r>
-      <w:r>
-        <w:rPr>
-          <w:rFonts w:ascii="Microsoft YaHei" w:hAnsi="Microsoft YaHei"/>
-          <w:b/>
-          <w:i w:val="0"/>
-          <w:color w:val="961414"/>
-          <w:sz w:val="28"/>
-          <w:rFonts w:eastAsia="Microsoft YaHei" w:ascii="Microsoft YaHei"/>
-        </w:rPr>
-        <w:t>扫码</w:t>
-      </w:r>
-      <w:r>
-        <w:rPr>
-          <w:rFonts w:ascii="Calibri" w:hAnsi="Calibri"/>
-          <w:b w:val="0"/>
-          <w:i w:val="0"/>
-          <w:color w:val="787878"/>
-          <w:sz w:val="18"/>
-          <w:rFonts w:eastAsia="Microsoft YaHei" w:ascii="Calibri"/>
-        </w:rPr>
-        <w:t xml:space="preserve">   [SEPARABLE VERB]</w:t>
-      </w:r>
-    </w:p>
-    <w:p>
-      <w:pPr>
-        <w:spacing w:before="0" w:after="40"/>
-      </w:pPr>
-      <w:r>
-        <w:rPr>
-          <w:rFonts w:ascii="맑은 고딕" w:hAnsi="맑은 고딕"/>
-          <w:b w:val="0"/>
-          <w:i w:val="0"/>
-          <w:sz w:val="20"/>
-          <w:rFonts w:eastAsia="Microsoft YaHei" w:ascii="맑은 고딕"/>
-        </w:rPr>
-        <w:t xml:space="preserve">🔊 </w:t>
-      </w:r>
-      <w:r>
-        <w:rPr>
-          <w:rFonts w:ascii="Calibri" w:hAnsi="Calibri"/>
-          <w:b w:val="0"/>
-          <w:i/>
-          <w:color w:val="505050"/>
-          <w:sz w:val="20"/>
-          <w:rFonts w:eastAsia="Microsoft YaHei" w:ascii="Calibri"/>
-        </w:rPr>
-        <w:t>sǎomǎ</w:t>
-      </w:r>
-    </w:p>
-    <w:p>
-      <w:pPr>
-        <w:spacing w:before="0" w:after="60"/>
-      </w:pPr>
-      <w:r>
-        <w:rPr>
-          <w:rFonts w:ascii="맑은 고딕" w:hAnsi="맑은 고딕"/>
-          <w:b/>
-          <w:i w:val="0"/>
-          <w:color w:val="282828"/>
-          <w:sz w:val="20"/>
-          <w:rFonts w:eastAsia="Microsoft YaHei" w:ascii="맑은 고딕"/>
-        </w:rPr>
-        <w:t xml:space="preserve">💡 의미  </w:t>
-      </w:r>
-      <w:r>
-        <w:rPr>
-          <w:rFonts w:ascii="맑은 고딕" w:hAnsi="맑은 고딕"/>
-          <w:b w:val="0"/>
-          <w:i w:val="0"/>
-          <w:sz w:val="21"/>
-          <w:rFonts w:eastAsia="Microsoft YaHei" w:ascii="맑은 고딕"/>
-        </w:rPr>
-        <w:t>(QR 코드를) 스캔하다</w:t>
-      </w:r>
-    </w:p>
-    <w:p>
-      <w:pPr>
-        <w:spacing w:before="0" w:after="40"/>
-      </w:pPr>
-      <w:r>
-        <w:rPr>
-          <w:rFonts w:ascii="맑은 고딕" w:hAnsi="맑은 고딕"/>
-          <w:b/>
-          <w:i w:val="0"/>
-          <w:color w:val="646464"/>
-          <w:sz w:val="19"/>
-          <w:rFonts w:eastAsia="Microsoft YaHei" w:ascii="맑은 고딕"/>
-        </w:rPr>
-        <w:t xml:space="preserve">📌 원문  </w:t>
-      </w:r>
-      <w:r>
-        <w:rPr>
-          <w:rFonts w:ascii="Microsoft YaHei" w:hAnsi="Microsoft YaHei"/>
-          <w:b w:val="0"/>
-          <w:i/>
-          <w:color w:val="5A5A5A"/>
-          <w:sz w:val="19"/>
-          <w:rFonts w:eastAsia="Microsoft YaHei" w:ascii="Microsoft YaHei"/>
-        </w:rPr>
-        <w:t>"为获取密码“扫码添加"</w:t>
-      </w:r>
-    </w:p>
-    <w:p>
-      <w:pPr>
-        <w:spacing w:before="40" w:after="40"/>
-      </w:pPr>
-      <w:r>
-        <w:rPr>
-          <w:rFonts w:ascii="맑은 고딕" w:hAnsi="맑은 고딕"/>
-          <w:b/>
-          <w:i w:val="0"/>
-          <w:color w:val="B42828"/>
-          <w:sz w:val="20"/>
-          <w:rFonts w:eastAsia="Microsoft YaHei" w:ascii="맑은 고딕"/>
-        </w:rPr>
-        <w:t xml:space="preserve">✏️ 예문  </w:t>
-      </w:r>
-      <w:r>
-        <w:rPr>
-          <w:rFonts w:ascii="Microsoft YaHei" w:hAnsi="Microsoft YaHei"/>
-          <w:b/>
-          <w:i w:val="0"/>
-          <w:color w:val="8C1E1E"/>
-          <w:sz w:val="21"/>
-          <w:rFonts w:eastAsia="Microsoft YaHei" w:ascii="Microsoft YaHei"/>
-        </w:rPr>
-        <w:t>吃饭前记得扫码点餐，方便又快捷。</w:t>
+        <w:t>我们公司每年都会投入大量资金进行新产品的研发。</w:t>
       </w:r>
     </w:p>
     <w:sectPr>

</xml_diff>